<commit_message>
Rebuild KA Generator with hardcoded template structure and new JSON schema
- Rewrite KA_STRUCTURE_PROMPT to request only cyan (AI-generated) fields
  using new t1_*/t2_* schema aligned with color-coded KA_Template.docx
- Rewrite build_ka_docx Tables 1 & 2 with fully hardcoded static structure:
  Contact Info (Table 1 item 2) and Incident Details (item 4) are always static
  All other sub-bullets populated from t1_*/t2_* AI-generated fields
- Update State 4 preview UI to display new t1_*/t2_* field names correctly
- Update GAP_DETECTION_PROMPT section names to match new template structure
- Add two-level RECITATION_ERROR retry (Pro model → Flash fallback)
- Fix DOCX cell formatting using _cell_clear/_cell_p helpers with bullet chars

https://claude.ai/code/session_01G6dBGfkjd7ePwor7PTs1n9
</commit_message>
<xml_diff>
--- a/KA_Template.docx
+++ b/KA_Template.docx
@@ -45,6 +45,7 @@
                 <w:color w:val="FFFFFF" w:themeColor="background1"/>
                 <w:sz w:val="24"/>
                 <w:szCs w:val="24"/>
+                <w:highlight w:val="green"/>
               </w:rPr>
               <w:t>Knowledge Article</w:t>
             </w:r>
@@ -83,8 +84,9 @@
                 <w:rFonts w:ascii="Arial" w:hAnsi="Arial" w:cs="Arial"/>
                 <w:sz w:val="24"/>
                 <w:szCs w:val="24"/>
-              </w:rPr>
-              <w:t>Title</w:t>
+                <w:highlight w:val="green"/>
+              </w:rPr>
+              <w:t>Title:</w:t>
             </w:r>
             <w:r>
               <w:rPr>
@@ -92,7 +94,16 @@
                 <w:sz w:val="24"/>
                 <w:szCs w:val="24"/>
               </w:rPr>
-              <w:t>:</w:t>
+              <w:t xml:space="preserve"> </w:t>
+            </w:r>
+            <w:r>
+              <w:rPr>
+                <w:rFonts w:ascii="Arial" w:hAnsi="Arial" w:cs="Arial"/>
+                <w:sz w:val="24"/>
+                <w:szCs w:val="24"/>
+                <w:highlight w:val="cyan"/>
+              </w:rPr>
+              <w:t>Title Words</w:t>
             </w:r>
           </w:p>
         </w:tc>
@@ -114,6 +125,7 @@
                 <w:rFonts w:cs="Arial"/>
                 <w:sz w:val="24"/>
                 <w:szCs w:val="24"/>
+                <w:highlight w:val="cyan"/>
               </w:rPr>
             </w:pPr>
             <w:r>
@@ -122,6 +134,7 @@
                 <w:color w:val="333333"/>
                 <w:sz w:val="24"/>
                 <w:szCs w:val="24"/>
+                <w:highlight w:val="cyan"/>
               </w:rPr>
               <w:t xml:space="preserve">CVN </w:t>
             </w:r>
@@ -131,6 +144,7 @@
                 <w:color w:val="333333"/>
                 <w:sz w:val="24"/>
                 <w:szCs w:val="24"/>
+                <w:highlight w:val="cyan"/>
               </w:rPr>
               <w:t xml:space="preserve">FSE/FSW Equipment </w:t>
             </w:r>
@@ -140,6 +154,7 @@
                 <w:color w:val="333333"/>
                 <w:sz w:val="24"/>
                 <w:szCs w:val="24"/>
+                <w:highlight w:val="cyan"/>
               </w:rPr>
               <w:t>Failure</w:t>
             </w:r>
@@ -149,6 +164,7 @@
                 <w:color w:val="333333"/>
                 <w:sz w:val="24"/>
                 <w:szCs w:val="24"/>
+                <w:highlight w:val="cyan"/>
               </w:rPr>
               <w:t xml:space="preserve"> Reporting</w:t>
             </w:r>
@@ -179,6 +195,7 @@
                 <w:rFonts w:ascii="Arial" w:hAnsi="Arial" w:cs="Arial"/>
                 <w:sz w:val="24"/>
                 <w:szCs w:val="24"/>
+                <w:highlight w:val="green"/>
               </w:rPr>
             </w:pPr>
             <w:r>
@@ -186,8 +203,27 @@
                 <w:rFonts w:ascii="Arial" w:hAnsi="Arial" w:cs="Arial"/>
                 <w:sz w:val="24"/>
                 <w:szCs w:val="24"/>
+                <w:highlight w:val="green"/>
               </w:rPr>
               <w:t>Category:</w:t>
+            </w:r>
+            <w:r>
+              <w:rPr>
+                <w:rFonts w:ascii="Arial" w:hAnsi="Arial" w:cs="Arial"/>
+                <w:sz w:val="24"/>
+                <w:szCs w:val="24"/>
+                <w:highlight w:val="green"/>
+              </w:rPr>
+              <w:t xml:space="preserve"> </w:t>
+            </w:r>
+            <w:r>
+              <w:rPr>
+                <w:rFonts w:ascii="Arial" w:hAnsi="Arial" w:cs="Arial"/>
+                <w:sz w:val="24"/>
+                <w:szCs w:val="24"/>
+                <w:highlight w:val="cyan"/>
+              </w:rPr>
+              <w:t>Category Words</w:t>
             </w:r>
           </w:p>
         </w:tc>
@@ -210,6 +246,7 @@
                 <w:rFonts w:cs="Arial"/>
                 <w:sz w:val="24"/>
                 <w:szCs w:val="24"/>
+                <w:highlight w:val="green"/>
               </w:rPr>
             </w:pPr>
             <w:r>
@@ -217,6 +254,7 @@
                 <w:rFonts w:cs="Arial"/>
                 <w:sz w:val="24"/>
                 <w:szCs w:val="24"/>
+                <w:highlight w:val="green"/>
               </w:rPr>
               <w:t xml:space="preserve">FLANK SPEED </w:t>
             </w:r>
@@ -225,6 +263,7 @@
                 <w:rFonts w:cs="Arial"/>
                 <w:sz w:val="24"/>
                 <w:szCs w:val="24"/>
+                <w:highlight w:val="green"/>
               </w:rPr>
               <w:t>EDGE (FSE)</w:t>
             </w:r>
@@ -233,6 +272,7 @@
                 <w:rFonts w:cs="Arial"/>
                 <w:sz w:val="24"/>
                 <w:szCs w:val="24"/>
+                <w:highlight w:val="green"/>
               </w:rPr>
               <w:t xml:space="preserve"> / FLANK SPEED WIRELESS (FSW)</w:t>
             </w:r>
@@ -317,6 +357,7 @@
                 <w:color w:val="FFFFFF" w:themeColor="background1"/>
                 <w:sz w:val="24"/>
                 <w:szCs w:val="24"/>
+                <w:highlight w:val="green"/>
               </w:rPr>
               <w:t xml:space="preserve">Notes to </w:t>
             </w:r>
@@ -326,6 +367,7 @@
                 <w:color w:val="FFFFFF" w:themeColor="background1"/>
                 <w:sz w:val="24"/>
                 <w:szCs w:val="24"/>
+                <w:highlight w:val="green"/>
               </w:rPr>
               <w:t>Agent</w:t>
             </w:r>
@@ -335,6 +377,7 @@
                 <w:color w:val="FFFFFF" w:themeColor="background1"/>
                 <w:sz w:val="24"/>
                 <w:szCs w:val="24"/>
+                <w:highlight w:val="green"/>
               </w:rPr>
               <w:t xml:space="preserve"> (</w:t>
             </w:r>
@@ -344,6 +387,7 @@
                 <w:color w:val="FFFFFF" w:themeColor="background1"/>
                 <w:sz w:val="24"/>
                 <w:szCs w:val="24"/>
+                <w:highlight w:val="green"/>
               </w:rPr>
               <w:t>Internal Use</w:t>
             </w:r>
@@ -353,6 +397,7 @@
                 <w:color w:val="FFFFFF" w:themeColor="background1"/>
                 <w:sz w:val="24"/>
                 <w:szCs w:val="24"/>
+                <w:highlight w:val="green"/>
               </w:rPr>
               <w:t xml:space="preserve"> Only)</w:t>
             </w:r>
@@ -361,7 +406,7 @@
       </w:tr>
       <w:tr>
         <w:trPr>
-          <w:trHeight w:val="3500"/>
+          <w:trHeight w:val="6173"/>
           <w:jc w:val="center"/>
         </w:trPr>
         <w:tc>
@@ -396,6 +441,7 @@
                 <w:color w:val="333333"/>
                 <w:sz w:val="20"/>
                 <w:szCs w:val="20"/>
+                <w:highlight w:val="green"/>
                 <w:shd w:val="clear" w:color="auto" w:fill="FFFFFF"/>
               </w:rPr>
               <w:t>Overview</w:t>
@@ -435,6 +481,7 @@
                 <w:color w:val="333333"/>
                 <w:sz w:val="20"/>
                 <w:szCs w:val="20"/>
+                <w:highlight w:val="cyan"/>
                 <w:shd w:val="clear" w:color="auto" w:fill="FFFFFF"/>
               </w:rPr>
               <w:t>This knowledge article</w:t>
@@ -446,6 +493,7 @@
                 <w:color w:val="333333"/>
                 <w:sz w:val="20"/>
                 <w:szCs w:val="20"/>
+                <w:highlight w:val="cyan"/>
                 <w:shd w:val="clear" w:color="auto" w:fill="FFFFFF"/>
               </w:rPr>
               <w:t xml:space="preserve"> is for </w:t>
@@ -457,6 +505,7 @@
                 <w:color w:val="333333"/>
                 <w:sz w:val="20"/>
                 <w:szCs w:val="20"/>
+                <w:highlight w:val="cyan"/>
                 <w:shd w:val="clear" w:color="auto" w:fill="FFFFFF"/>
               </w:rPr>
               <w:t>u</w:t>
@@ -468,6 +517,7 @@
                 <w:color w:val="333333"/>
                 <w:sz w:val="20"/>
                 <w:szCs w:val="20"/>
+                <w:highlight w:val="cyan"/>
                 <w:shd w:val="clear" w:color="auto" w:fill="FFFFFF"/>
               </w:rPr>
               <w:t xml:space="preserve">sers </w:t>
@@ -479,6 +529,7 @@
                 <w:color w:val="333333"/>
                 <w:sz w:val="20"/>
                 <w:szCs w:val="20"/>
+                <w:highlight w:val="cyan"/>
                 <w:shd w:val="clear" w:color="auto" w:fill="FFFFFF"/>
               </w:rPr>
               <w:t xml:space="preserve">needing to </w:t>
@@ -490,6 +541,7 @@
                 <w:color w:val="333333"/>
                 <w:sz w:val="20"/>
                 <w:szCs w:val="20"/>
+                <w:highlight w:val="cyan"/>
                 <w:shd w:val="clear" w:color="auto" w:fill="FFFFFF"/>
               </w:rPr>
               <w:t>report</w:t>
@@ -501,6 +553,7 @@
                 <w:color w:val="333333"/>
                 <w:sz w:val="20"/>
                 <w:szCs w:val="20"/>
+                <w:highlight w:val="cyan"/>
                 <w:shd w:val="clear" w:color="auto" w:fill="FFFFFF"/>
               </w:rPr>
               <w:t xml:space="preserve"> failure of an </w:t>
@@ -512,6 +565,7 @@
                 <w:color w:val="333333"/>
                 <w:sz w:val="20"/>
                 <w:szCs w:val="20"/>
+                <w:highlight w:val="cyan"/>
                 <w:shd w:val="clear" w:color="auto" w:fill="FFFFFF"/>
               </w:rPr>
               <w:t xml:space="preserve">FSE </w:t>
@@ -523,6 +577,7 @@
                 <w:color w:val="333333"/>
                 <w:sz w:val="20"/>
                 <w:szCs w:val="20"/>
+                <w:highlight w:val="cyan"/>
                 <w:shd w:val="clear" w:color="auto" w:fill="FFFFFF"/>
               </w:rPr>
               <w:t>component</w:t>
@@ -534,6 +589,7 @@
                 <w:color w:val="333333"/>
                 <w:sz w:val="20"/>
                 <w:szCs w:val="20"/>
+                <w:highlight w:val="cyan"/>
                 <w:shd w:val="clear" w:color="auto" w:fill="FFFFFF"/>
               </w:rPr>
               <w:t xml:space="preserve"> </w:t>
@@ -545,6 +601,7 @@
                 <w:color w:val="333333"/>
                 <w:sz w:val="20"/>
                 <w:szCs w:val="20"/>
+                <w:highlight w:val="cyan"/>
                 <w:shd w:val="clear" w:color="auto" w:fill="FFFFFF"/>
               </w:rPr>
               <w:t>associated with</w:t>
@@ -556,6 +613,7 @@
                 <w:color w:val="333333"/>
                 <w:sz w:val="20"/>
                 <w:szCs w:val="20"/>
+                <w:highlight w:val="cyan"/>
                 <w:shd w:val="clear" w:color="auto" w:fill="FFFFFF"/>
               </w:rPr>
               <w:t xml:space="preserve"> a </w:t>
@@ -565,6 +623,7 @@
                 <w:rFonts w:ascii="Arial" w:eastAsia="Arial" w:hAnsi="Arial" w:cs="Arial"/>
                 <w:sz w:val="20"/>
                 <w:szCs w:val="20"/>
+                <w:highlight w:val="cyan"/>
               </w:rPr>
               <w:t>FSW</w:t>
             </w:r>
@@ -573,6 +632,7 @@
                 <w:rFonts w:ascii="Arial" w:eastAsia="Arial" w:hAnsi="Arial" w:cs="Arial"/>
                 <w:sz w:val="20"/>
                 <w:szCs w:val="20"/>
+                <w:highlight w:val="cyan"/>
               </w:rPr>
               <w:t xml:space="preserve"> </w:t>
             </w:r>
@@ -581,6 +641,7 @@
                 <w:rFonts w:ascii="Arial" w:eastAsia="Arial" w:hAnsi="Arial" w:cs="Arial"/>
                 <w:sz w:val="20"/>
                 <w:szCs w:val="20"/>
+                <w:highlight w:val="cyan"/>
               </w:rPr>
               <w:t>installation aboard a</w:t>
             </w:r>
@@ -589,6 +650,7 @@
                 <w:rFonts w:ascii="Arial" w:eastAsia="Arial" w:hAnsi="Arial" w:cs="Arial"/>
                 <w:sz w:val="20"/>
                 <w:szCs w:val="20"/>
+                <w:highlight w:val="cyan"/>
               </w:rPr>
               <w:t>n</w:t>
             </w:r>
@@ -597,6 +659,7 @@
                 <w:rFonts w:ascii="Arial" w:eastAsia="Arial" w:hAnsi="Arial" w:cs="Arial"/>
                 <w:sz w:val="20"/>
                 <w:szCs w:val="20"/>
+                <w:highlight w:val="cyan"/>
               </w:rPr>
               <w:t xml:space="preserve"> </w:t>
             </w:r>
@@ -605,6 +668,7 @@
                 <w:rFonts w:ascii="Arial" w:eastAsia="Arial" w:hAnsi="Arial" w:cs="Arial"/>
                 <w:sz w:val="20"/>
                 <w:szCs w:val="20"/>
+                <w:highlight w:val="cyan"/>
               </w:rPr>
               <w:t>Aircraft Carrier, Nuclear (CVN).</w:t>
             </w:r>
@@ -643,6 +707,7 @@
                 <w:color w:val="333333"/>
                 <w:sz w:val="20"/>
                 <w:szCs w:val="20"/>
+                <w:highlight w:val="green"/>
               </w:rPr>
               <w:t xml:space="preserve">Tier </w:t>
             </w:r>
@@ -655,6 +720,7 @@
                 <w:color w:val="333333"/>
                 <w:sz w:val="20"/>
                 <w:szCs w:val="20"/>
+                <w:highlight w:val="green"/>
               </w:rPr>
               <w:t>I</w:t>
             </w:r>
@@ -667,6 +733,7 @@
                 <w:color w:val="333333"/>
                 <w:sz w:val="20"/>
                 <w:szCs w:val="20"/>
+                <w:highlight w:val="green"/>
               </w:rPr>
               <w:t xml:space="preserve"> Agent Action</w:t>
             </w:r>
@@ -712,6 +779,7 @@
                 <w:color w:val="333333"/>
                 <w:sz w:val="20"/>
                 <w:szCs w:val="20"/>
+                <w:highlight w:val="green"/>
               </w:rPr>
             </w:pPr>
             <w:r>
@@ -721,6 +789,7 @@
                 <w:color w:val="333333"/>
                 <w:sz w:val="20"/>
                 <w:szCs w:val="20"/>
+                <w:highlight w:val="green"/>
               </w:rPr>
               <w:t xml:space="preserve">Document the following information prior to escalation. </w:t>
             </w:r>
@@ -742,6 +811,7 @@
                 <w:rFonts w:ascii="Arial" w:eastAsia="Arial" w:hAnsi="Arial" w:cs="Arial"/>
                 <w:sz w:val="20"/>
                 <w:szCs w:val="20"/>
+                <w:highlight w:val="green"/>
               </w:rPr>
             </w:pPr>
             <w:r>
@@ -751,6 +821,7 @@
                 <w:color w:val="333333"/>
                 <w:sz w:val="20"/>
                 <w:szCs w:val="20"/>
+                <w:highlight w:val="green"/>
               </w:rPr>
               <w:t xml:space="preserve">Location Data. </w:t>
             </w:r>
@@ -765,11 +836,13 @@
               <w:spacing w:line="257" w:lineRule="auto"/>
               <w:rPr>
                 <w:rFonts w:ascii="Arial" w:eastAsia="Arial" w:hAnsi="Arial" w:cs="Arial"/>
-              </w:rPr>
-            </w:pPr>
-            <w:r>
-              <w:rPr>
-                <w:rFonts w:ascii="Arial" w:eastAsia="Arial" w:hAnsi="Arial" w:cs="Arial"/>
+                <w:highlight w:val="cyan"/>
+              </w:rPr>
+            </w:pPr>
+            <w:r>
+              <w:rPr>
+                <w:rFonts w:ascii="Arial" w:eastAsia="Arial" w:hAnsi="Arial" w:cs="Arial"/>
+                <w:highlight w:val="cyan"/>
               </w:rPr>
               <w:t>Ship Class / Hull Number (Do not request any geographical information)</w:t>
             </w:r>
@@ -789,8 +862,15 @@
             <w:r>
               <w:rPr>
                 <w:rFonts w:ascii="Arial" w:eastAsia="Arial" w:hAnsi="Arial" w:cs="Arial"/>
-              </w:rPr>
-              <w:t xml:space="preserve">Contact Information. </w:t>
+                <w:highlight w:val="green"/>
+              </w:rPr>
+              <w:t>Contact Information</w:t>
+            </w:r>
+            <w:r>
+              <w:rPr>
+                <w:rFonts w:ascii="Arial" w:eastAsia="Arial" w:hAnsi="Arial" w:cs="Arial"/>
+              </w:rPr>
+              <w:t xml:space="preserve">. </w:t>
             </w:r>
           </w:p>
           <w:p>
@@ -802,11 +882,15 @@
               </w:numPr>
               <w:spacing w:line="257" w:lineRule="auto"/>
               <w:ind w:left="720"/>
+              <w:rPr>
+                <w:highlight w:val="cyan"/>
+              </w:rPr>
             </w:pPr>
             <w:r>
               <w:rPr>
                 <w:rFonts w:ascii="Arial" w:eastAsia="Arial" w:hAnsi="Arial" w:cs="Arial"/>
                 <w:color w:val="000000" w:themeColor="text1"/>
+                <w:highlight w:val="cyan"/>
               </w:rPr>
               <w:t>Email and Phone (if available) for primary and secondary contacts.</w:t>
             </w:r>
@@ -820,11 +904,15 @@
               </w:numPr>
               <w:spacing w:line="257" w:lineRule="auto"/>
               <w:ind w:left="720"/>
+              <w:rPr>
+                <w:highlight w:val="cyan"/>
+              </w:rPr>
             </w:pPr>
             <w:r>
               <w:rPr>
                 <w:rFonts w:ascii="Arial" w:eastAsia="Arial" w:hAnsi="Arial" w:cs="Arial"/>
                 <w:color w:val="000000" w:themeColor="text1"/>
+                <w:highlight w:val="cyan"/>
               </w:rPr>
               <w:t>Quarterdeck or Radio/ADP phone (if available).</w:t>
             </w:r>
@@ -839,11 +927,13 @@
               <w:spacing w:line="257" w:lineRule="auto"/>
               <w:rPr>
                 <w:rFonts w:ascii="Arial" w:eastAsia="Arial" w:hAnsi="Arial" w:cs="Arial"/>
-              </w:rPr>
-            </w:pPr>
-            <w:r>
-              <w:rPr>
-                <w:rFonts w:ascii="Arial" w:eastAsia="Arial" w:hAnsi="Arial" w:cs="Arial"/>
+                <w:highlight w:val="green"/>
+              </w:rPr>
+            </w:pPr>
+            <w:r>
+              <w:rPr>
+                <w:rFonts w:ascii="Arial" w:eastAsia="Arial" w:hAnsi="Arial" w:cs="Arial"/>
+                <w:highlight w:val="green"/>
               </w:rPr>
               <w:t xml:space="preserve">System error details. </w:t>
             </w:r>
@@ -858,19 +948,15 @@
               <w:spacing w:line="257" w:lineRule="auto"/>
               <w:rPr>
                 <w:rFonts w:ascii="Arial" w:eastAsia="Arial" w:hAnsi="Arial" w:cs="Arial"/>
-              </w:rPr>
-            </w:pPr>
-            <w:r>
-              <w:rPr>
-                <w:rFonts w:ascii="Arial" w:eastAsia="Arial" w:hAnsi="Arial" w:cs="Arial"/>
-              </w:rPr>
-              <w:t xml:space="preserve">Provide affected </w:t>
-            </w:r>
-            <w:r>
-              <w:rPr>
-                <w:rFonts w:ascii="Arial" w:eastAsia="Arial" w:hAnsi="Arial" w:cs="Arial"/>
-              </w:rPr>
-              <w:t>product name category</w:t>
+                <w:highlight w:val="cyan"/>
+              </w:rPr>
+            </w:pPr>
+            <w:r>
+              <w:rPr>
+                <w:rFonts w:ascii="Arial" w:eastAsia="Arial" w:hAnsi="Arial" w:cs="Arial"/>
+                <w:highlight w:val="cyan"/>
+              </w:rPr>
+              <w:t>Provide affected product name category</w:t>
             </w:r>
           </w:p>
           <w:p>
@@ -883,65 +969,55 @@
               <w:spacing w:line="257" w:lineRule="auto"/>
               <w:rPr>
                 <w:rFonts w:ascii="Arial" w:eastAsia="Arial" w:hAnsi="Arial" w:cs="Arial"/>
-              </w:rPr>
-            </w:pPr>
-            <w:r>
-              <w:rPr>
-                <w:rFonts w:ascii="Arial" w:eastAsia="Arial" w:hAnsi="Arial" w:cs="Arial"/>
-              </w:rPr>
-              <w:t>Specific component</w:t>
-            </w:r>
-            <w:r>
-              <w:rPr>
-                <w:rFonts w:ascii="Arial" w:eastAsia="Arial" w:hAnsi="Arial" w:cs="Arial"/>
-              </w:rPr>
-              <w:t xml:space="preserve"> nomenclature, serial and</w:t>
-            </w:r>
-            <w:r>
-              <w:rPr>
-                <w:rFonts w:ascii="Arial" w:eastAsia="Arial" w:hAnsi="Arial" w:cs="Arial"/>
-              </w:rPr>
-              <w:t xml:space="preserve"> part number</w:t>
-            </w:r>
-            <w:r>
-              <w:rPr>
-                <w:rFonts w:ascii="Arial" w:eastAsia="Arial" w:hAnsi="Arial" w:cs="Arial"/>
-              </w:rPr>
-              <w:t>,</w:t>
-            </w:r>
-            <w:r>
-              <w:rPr>
-                <w:rFonts w:ascii="Arial" w:eastAsia="Arial" w:hAnsi="Arial" w:cs="Arial"/>
+                <w:highlight w:val="cyan"/>
+              </w:rPr>
+            </w:pPr>
+            <w:r>
+              <w:rPr>
+                <w:rFonts w:ascii="Arial" w:eastAsia="Arial" w:hAnsi="Arial" w:cs="Arial"/>
+                <w:highlight w:val="cyan"/>
+              </w:rPr>
+              <w:t>Specific component nomenclature, serial and part number,</w:t>
+            </w:r>
+            <w:r>
+              <w:rPr>
+                <w:rFonts w:ascii="Arial" w:eastAsia="Arial" w:hAnsi="Arial" w:cs="Arial"/>
+                <w:highlight w:val="cyan"/>
               </w:rPr>
               <w:t xml:space="preserve"> and rack location (</w:t>
             </w:r>
             <w:r>
               <w:rPr>
                 <w:rFonts w:ascii="Arial" w:eastAsia="Arial" w:hAnsi="Arial" w:cs="Arial"/>
+                <w:highlight w:val="cyan"/>
               </w:rPr>
               <w:t>“</w:t>
             </w:r>
             <w:r>
               <w:rPr>
                 <w:rFonts w:ascii="Arial" w:eastAsia="Arial" w:hAnsi="Arial" w:cs="Arial"/>
+                <w:highlight w:val="cyan"/>
               </w:rPr>
               <w:t>U</w:t>
             </w:r>
             <w:r>
               <w:rPr>
                 <w:rFonts w:ascii="Arial" w:eastAsia="Arial" w:hAnsi="Arial" w:cs="Arial"/>
+                <w:highlight w:val="cyan"/>
               </w:rPr>
               <w:t>”</w:t>
             </w:r>
             <w:r>
               <w:rPr>
                 <w:rFonts w:ascii="Arial" w:eastAsia="Arial" w:hAnsi="Arial" w:cs="Arial"/>
+                <w:highlight w:val="cyan"/>
               </w:rPr>
               <w:t xml:space="preserve"> Location)</w:t>
             </w:r>
             <w:r>
               <w:rPr>
                 <w:rFonts w:ascii="Arial" w:eastAsia="Arial" w:hAnsi="Arial" w:cs="Arial"/>
+                <w:highlight w:val="cyan"/>
               </w:rPr>
               <w:t xml:space="preserve"> </w:t>
             </w:r>
@@ -956,11 +1032,13 @@
               <w:spacing w:line="257" w:lineRule="auto"/>
               <w:rPr>
                 <w:rFonts w:ascii="Arial" w:eastAsia="Arial" w:hAnsi="Arial" w:cs="Arial"/>
-              </w:rPr>
-            </w:pPr>
-            <w:r>
-              <w:rPr>
-                <w:rFonts w:ascii="Arial" w:eastAsia="Arial" w:hAnsi="Arial" w:cs="Arial"/>
+                <w:highlight w:val="green"/>
+              </w:rPr>
+            </w:pPr>
+            <w:r>
+              <w:rPr>
+                <w:rFonts w:ascii="Arial" w:eastAsia="Arial" w:hAnsi="Arial" w:cs="Arial"/>
+                <w:highlight w:val="green"/>
               </w:rPr>
               <w:t>Incident Details.</w:t>
             </w:r>
@@ -975,18 +1053,21 @@
               <w:spacing w:line="257" w:lineRule="auto"/>
               <w:rPr>
                 <w:rFonts w:ascii="Arial" w:eastAsia="Arial" w:hAnsi="Arial" w:cs="Arial"/>
+                <w:highlight w:val="cyan"/>
               </w:rPr>
             </w:pPr>
             <w:r>
               <w:rPr>
                 <w:rFonts w:ascii="Arial" w:eastAsia="Arial" w:hAnsi="Arial" w:cs="Arial"/>
                 <w:color w:val="000000" w:themeColor="text1"/>
+                <w:highlight w:val="cyan"/>
               </w:rPr>
               <w:t>Detailed description of the error along with any actions taken prior to the error.</w:t>
             </w:r>
             <w:r>
               <w:rPr>
                 <w:rFonts w:ascii="Arial" w:eastAsia="Arial" w:hAnsi="Arial" w:cs="Arial"/>
+                <w:highlight w:val="cyan"/>
               </w:rPr>
               <w:t xml:space="preserve"> </w:t>
             </w:r>
@@ -999,11 +1080,15 @@
                 <w:numId w:val="10"/>
               </w:numPr>
               <w:spacing w:line="257" w:lineRule="auto"/>
+              <w:rPr>
+                <w:highlight w:val="cyan"/>
+              </w:rPr>
             </w:pPr>
             <w:r>
               <w:rPr>
                 <w:rFonts w:ascii="Arial" w:eastAsia="Arial" w:hAnsi="Arial" w:cs="Arial"/>
                 <w:color w:val="000000" w:themeColor="text1"/>
+                <w:highlight w:val="cyan"/>
               </w:rPr>
               <w:t>What symptoms were observed (system message, email alert, system inoperable, etc.)?</w:t>
             </w:r>
@@ -1016,6 +1101,9 @@
                 <w:numId w:val="10"/>
               </w:numPr>
               <w:spacing w:line="257" w:lineRule="auto"/>
+              <w:rPr>
+                <w:highlight w:val="cyan"/>
+              </w:rPr>
             </w:pPr>
             <w:r>
               <w:rPr>
@@ -1023,6 +1111,7 @@
                 <w:color w:val="000000" w:themeColor="text1"/>
                 <w:sz w:val="19"/>
                 <w:szCs w:val="19"/>
+                <w:highlight w:val="cyan"/>
               </w:rPr>
               <w:t>Any documentation/KAs attempted following the error.</w:t>
             </w:r>
@@ -1035,11 +1124,15 @@
                 <w:numId w:val="6"/>
               </w:numPr>
               <w:spacing w:line="257" w:lineRule="auto"/>
+              <w:rPr>
+                <w:highlight w:val="green"/>
+              </w:rPr>
             </w:pPr>
             <w:r>
               <w:rPr>
                 <w:rFonts w:ascii="Arial" w:eastAsia="Arial" w:hAnsi="Arial" w:cs="Arial"/>
                 <w:color w:val="000000" w:themeColor="text1"/>
+                <w:highlight w:val="green"/>
               </w:rPr>
               <w:t>Any Error Messages or prompts encountered.</w:t>
             </w:r>
@@ -1054,11 +1147,13 @@
               <w:spacing w:line="257" w:lineRule="auto"/>
               <w:rPr>
                 <w:rFonts w:ascii="Arial" w:eastAsia="Arial" w:hAnsi="Arial" w:cs="Arial"/>
-              </w:rPr>
-            </w:pPr>
-            <w:r>
-              <w:rPr>
-                <w:rFonts w:ascii="Arial" w:eastAsia="Arial" w:hAnsi="Arial" w:cs="Arial"/>
+                <w:highlight w:val="cyan"/>
+              </w:rPr>
+            </w:pPr>
+            <w:r>
+              <w:rPr>
+                <w:rFonts w:ascii="Arial" w:eastAsia="Arial" w:hAnsi="Arial" w:cs="Arial"/>
+                <w:highlight w:val="cyan"/>
               </w:rPr>
               <w:t>All error messages or error codes encountered.</w:t>
             </w:r>
@@ -1073,17 +1168,20 @@
               <w:spacing w:line="257" w:lineRule="auto"/>
               <w:rPr>
                 <w:rFonts w:ascii="Arial" w:eastAsia="Arial" w:hAnsi="Arial" w:cs="Arial"/>
-              </w:rPr>
-            </w:pPr>
-            <w:r>
-              <w:rPr>
-                <w:rFonts w:ascii="Arial" w:eastAsia="Arial" w:hAnsi="Arial" w:cs="Arial"/>
+                <w:highlight w:val="cyan"/>
+              </w:rPr>
+            </w:pPr>
+            <w:r>
+              <w:rPr>
+                <w:rFonts w:ascii="Arial" w:eastAsia="Arial" w:hAnsi="Arial" w:cs="Arial"/>
+                <w:highlight w:val="cyan"/>
               </w:rPr>
               <w:t>Any</w:t>
             </w:r>
             <w:r>
               <w:rPr>
                 <w:rFonts w:ascii="Arial" w:eastAsia="Arial" w:hAnsi="Arial" w:cs="Arial"/>
+                <w:highlight w:val="cyan"/>
               </w:rPr>
               <w:t xml:space="preserve"> relevant logs, screenshots, or documentation.</w:t>
             </w:r>
@@ -1098,11 +1196,13 @@
               <w:spacing w:line="257" w:lineRule="auto"/>
               <w:rPr>
                 <w:rFonts w:ascii="Arial" w:eastAsia="Arial" w:hAnsi="Arial" w:cs="Arial"/>
-              </w:rPr>
-            </w:pPr>
-            <w:r>
-              <w:rPr>
-                <w:rFonts w:ascii="Arial" w:eastAsia="Arial" w:hAnsi="Arial" w:cs="Arial"/>
+                <w:highlight w:val="green"/>
+              </w:rPr>
+            </w:pPr>
+            <w:r>
+              <w:rPr>
+                <w:rFonts w:ascii="Arial" w:eastAsia="Arial" w:hAnsi="Arial" w:cs="Arial"/>
+                <w:highlight w:val="green"/>
               </w:rPr>
               <w:t>Any underlying or associated issues that may have contributed to the incident.</w:t>
             </w:r>
@@ -1117,11 +1217,13 @@
               <w:spacing w:line="257" w:lineRule="auto"/>
               <w:rPr>
                 <w:rFonts w:ascii="Arial" w:eastAsia="Arial" w:hAnsi="Arial" w:cs="Arial"/>
-              </w:rPr>
-            </w:pPr>
-            <w:r>
-              <w:rPr>
-                <w:rFonts w:ascii="Arial" w:eastAsia="Arial" w:hAnsi="Arial" w:cs="Arial"/>
+                <w:highlight w:val="cyan"/>
+              </w:rPr>
+            </w:pPr>
+            <w:r>
+              <w:rPr>
+                <w:rFonts w:ascii="Arial" w:eastAsia="Arial" w:hAnsi="Arial" w:cs="Arial"/>
+                <w:highlight w:val="cyan"/>
               </w:rPr>
               <w:t>Environmental conditions (impactful climate, sea state, etc.)</w:t>
             </w:r>
@@ -1136,11 +1238,13 @@
               <w:spacing w:line="257" w:lineRule="auto"/>
               <w:rPr>
                 <w:rFonts w:ascii="Arial" w:eastAsia="Arial" w:hAnsi="Arial" w:cs="Arial"/>
-              </w:rPr>
-            </w:pPr>
-            <w:r>
-              <w:rPr>
-                <w:rFonts w:ascii="Arial" w:eastAsia="Arial" w:hAnsi="Arial" w:cs="Arial"/>
+                <w:highlight w:val="cyan"/>
+              </w:rPr>
+            </w:pPr>
+            <w:r>
+              <w:rPr>
+                <w:rFonts w:ascii="Arial" w:eastAsia="Arial" w:hAnsi="Arial" w:cs="Arial"/>
+                <w:highlight w:val="cyan"/>
               </w:rPr>
               <w:t>Physical conditions (power outages, hardware failures, etc.)</w:t>
             </w:r>
@@ -1155,11 +1259,13 @@
               <w:spacing w:line="257" w:lineRule="auto"/>
               <w:rPr>
                 <w:rFonts w:ascii="Arial" w:eastAsia="Arial" w:hAnsi="Arial" w:cs="Arial"/>
-              </w:rPr>
-            </w:pPr>
-            <w:r>
-              <w:rPr>
-                <w:rFonts w:ascii="Arial" w:eastAsia="Arial" w:hAnsi="Arial" w:cs="Arial"/>
+                <w:highlight w:val="cyan"/>
+              </w:rPr>
+            </w:pPr>
+            <w:r>
+              <w:rPr>
+                <w:rFonts w:ascii="Arial" w:eastAsia="Arial" w:hAnsi="Arial" w:cs="Arial"/>
+                <w:highlight w:val="cyan"/>
               </w:rPr>
               <w:t>Operational conditions (software bugs, configuration issues, patches, etc.)</w:t>
             </w:r>
@@ -1174,23 +1280,27 @@
               <w:spacing w:line="257" w:lineRule="auto"/>
               <w:rPr>
                 <w:rFonts w:ascii="Arial" w:eastAsia="Arial" w:hAnsi="Arial" w:cs="Arial"/>
-              </w:rPr>
-            </w:pPr>
-            <w:r>
-              <w:rPr>
-                <w:rFonts w:ascii="Arial" w:eastAsia="Arial" w:hAnsi="Arial" w:cs="Arial"/>
+                <w:highlight w:val="cyan"/>
+              </w:rPr>
+            </w:pPr>
+            <w:r>
+              <w:rPr>
+                <w:rFonts w:ascii="Arial" w:eastAsia="Arial" w:hAnsi="Arial" w:cs="Arial"/>
+                <w:highlight w:val="cyan"/>
               </w:rPr>
               <w:t xml:space="preserve">Any immediate actions taken to </w:t>
             </w:r>
             <w:r>
               <w:rPr>
                 <w:rFonts w:ascii="Arial" w:eastAsia="Arial" w:hAnsi="Arial" w:cs="Arial"/>
+                <w:highlight w:val="cyan"/>
               </w:rPr>
               <w:t>address</w:t>
             </w:r>
             <w:r>
               <w:rPr>
                 <w:rFonts w:ascii="Arial" w:eastAsia="Arial" w:hAnsi="Arial" w:cs="Arial"/>
+                <w:highlight w:val="cyan"/>
               </w:rPr>
               <w:t xml:space="preserve"> the error.</w:t>
             </w:r>
@@ -1205,11 +1315,13 @@
               <w:spacing w:line="257" w:lineRule="auto"/>
               <w:rPr>
                 <w:rFonts w:ascii="Arial" w:eastAsia="Arial" w:hAnsi="Arial" w:cs="Arial"/>
-              </w:rPr>
-            </w:pPr>
-            <w:r>
-              <w:rPr>
-                <w:rFonts w:ascii="Arial" w:eastAsia="Arial" w:hAnsi="Arial" w:cs="Arial"/>
+                <w:highlight w:val="cyan"/>
+              </w:rPr>
+            </w:pPr>
+            <w:r>
+              <w:rPr>
+                <w:rFonts w:ascii="Arial" w:eastAsia="Arial" w:hAnsi="Arial" w:cs="Arial"/>
+                <w:highlight w:val="cyan"/>
               </w:rPr>
               <w:t xml:space="preserve">Associated documentation </w:t>
             </w:r>
@@ -1224,31 +1336,29 @@
               <w:spacing w:line="257" w:lineRule="auto"/>
               <w:rPr>
                 <w:rFonts w:ascii="Arial" w:eastAsia="Arial" w:hAnsi="Arial" w:cs="Arial"/>
-              </w:rPr>
-            </w:pPr>
-            <w:r>
-              <w:rPr>
-                <w:rFonts w:ascii="Arial" w:eastAsia="Arial" w:hAnsi="Arial" w:cs="Arial"/>
+                <w:highlight w:val="green"/>
+              </w:rPr>
+            </w:pPr>
+            <w:r>
+              <w:rPr>
+                <w:rFonts w:ascii="Arial" w:eastAsia="Arial" w:hAnsi="Arial" w:cs="Arial"/>
+                <w:highlight w:val="green"/>
               </w:rPr>
               <w:t xml:space="preserve">Any steps taken to </w:t>
             </w:r>
             <w:r>
               <w:rPr>
                 <w:rFonts w:ascii="Arial" w:eastAsia="Arial" w:hAnsi="Arial" w:cs="Arial"/>
+                <w:highlight w:val="green"/>
               </w:rPr>
               <w:t>address</w:t>
             </w:r>
             <w:r>
               <w:rPr>
                 <w:rFonts w:ascii="Arial" w:eastAsia="Arial" w:hAnsi="Arial" w:cs="Arial"/>
-              </w:rPr>
-              <w:t xml:space="preserve"> the issue when</w:t>
-            </w:r>
-            <w:r>
-              <w:rPr>
-                <w:rFonts w:ascii="Arial" w:eastAsia="Arial" w:hAnsi="Arial" w:cs="Arial"/>
-              </w:rPr>
-              <w:t xml:space="preserve"> it was encountered. </w:t>
+                <w:highlight w:val="green"/>
+              </w:rPr>
+              <w:t xml:space="preserve"> the issue when it was encountered. </w:t>
             </w:r>
           </w:p>
           <w:p>
@@ -1261,11 +1371,13 @@
               <w:spacing w:line="257" w:lineRule="auto"/>
               <w:rPr>
                 <w:rFonts w:ascii="Arial" w:eastAsia="Arial" w:hAnsi="Arial" w:cs="Arial"/>
-              </w:rPr>
-            </w:pPr>
-            <w:r>
-              <w:rPr>
-                <w:rFonts w:ascii="Arial" w:eastAsia="Arial" w:hAnsi="Arial" w:cs="Arial"/>
+                <w:highlight w:val="cyan"/>
+              </w:rPr>
+            </w:pPr>
+            <w:r>
+              <w:rPr>
+                <w:rFonts w:ascii="Arial" w:eastAsia="Arial" w:hAnsi="Arial" w:cs="Arial"/>
+                <w:highlight w:val="cyan"/>
               </w:rPr>
               <w:t>Associated documentation</w:t>
             </w:r>
@@ -1280,11 +1392,13 @@
               <w:spacing w:line="257" w:lineRule="auto"/>
               <w:rPr>
                 <w:rFonts w:ascii="Arial" w:eastAsia="Arial" w:hAnsi="Arial" w:cs="Arial"/>
-              </w:rPr>
-            </w:pPr>
-            <w:r>
-              <w:rPr>
-                <w:rFonts w:ascii="Arial" w:eastAsia="Arial" w:hAnsi="Arial" w:cs="Arial"/>
+                <w:highlight w:val="green"/>
+              </w:rPr>
+            </w:pPr>
+            <w:r>
+              <w:rPr>
+                <w:rFonts w:ascii="Arial" w:eastAsia="Arial" w:hAnsi="Arial" w:cs="Arial"/>
+                <w:highlight w:val="green"/>
               </w:rPr>
               <w:t>Impact Assessment</w:t>
             </w:r>
@@ -1300,23 +1414,27 @@
               <w:ind w:left="701"/>
               <w:rPr>
                 <w:rFonts w:ascii="Arial" w:eastAsia="Arial" w:hAnsi="Arial" w:cs="Arial"/>
-              </w:rPr>
-            </w:pPr>
-            <w:r>
-              <w:rPr>
-                <w:rFonts w:ascii="Arial" w:eastAsia="Arial" w:hAnsi="Arial" w:cs="Arial"/>
+                <w:highlight w:val="cyan"/>
+              </w:rPr>
+            </w:pPr>
+            <w:r>
+              <w:rPr>
+                <w:rFonts w:ascii="Arial" w:eastAsia="Arial" w:hAnsi="Arial" w:cs="Arial"/>
+                <w:highlight w:val="cyan"/>
               </w:rPr>
               <w:t xml:space="preserve">Any impact </w:t>
             </w:r>
             <w:r>
               <w:rPr>
                 <w:rFonts w:ascii="Arial" w:eastAsia="Arial" w:hAnsi="Arial" w:cs="Arial"/>
+                <w:highlight w:val="cyan"/>
               </w:rPr>
               <w:t>on</w:t>
             </w:r>
             <w:r>
               <w:rPr>
                 <w:rFonts w:ascii="Arial" w:eastAsia="Arial" w:hAnsi="Arial" w:cs="Arial"/>
+                <w:highlight w:val="cyan"/>
               </w:rPr>
               <w:t xml:space="preserve"> command operations or users? (system unavailability, performance degradation, CASREP, etc.)</w:t>
             </w:r>
@@ -1345,8 +1463,19 @@
                 <w:color w:val="333333"/>
                 <w:sz w:val="20"/>
                 <w:szCs w:val="20"/>
-              </w:rPr>
-              <w:t>Attach this knowledge article to the incident.</w:t>
+                <w:highlight w:val="green"/>
+              </w:rPr>
+              <w:t>Attach this knowledge article to the incident</w:t>
+            </w:r>
+            <w:r>
+              <w:rPr>
+                <w:rStyle w:val="normaltextrun"/>
+                <w:rFonts w:ascii="Arial" w:eastAsia="Arial" w:hAnsi="Arial" w:cs="Arial"/>
+                <w:color w:val="333333"/>
+                <w:sz w:val="20"/>
+                <w:szCs w:val="20"/>
+              </w:rPr>
+              <w:t>.</w:t>
             </w:r>
             <w:r>
               <w:rPr>
@@ -1374,6 +1503,7 @@
                 <w:rFonts w:ascii="Arial" w:eastAsia="Arial" w:hAnsi="Arial" w:cs="Arial"/>
                 <w:sz w:val="20"/>
                 <w:szCs w:val="20"/>
+                <w:highlight w:val="cyan"/>
               </w:rPr>
             </w:pPr>
             <w:r>
@@ -1381,6 +1511,7 @@
                 <w:rFonts w:ascii="Arial" w:eastAsia="Arial" w:hAnsi="Arial" w:cs="Arial"/>
                 <w:sz w:val="20"/>
                 <w:szCs w:val="20"/>
+                <w:highlight w:val="cyan"/>
               </w:rPr>
               <w:t xml:space="preserve">Escalate the incident to </w:t>
             </w:r>
@@ -1391,6 +1522,7 @@
                 <w:bCs/>
                 <w:sz w:val="20"/>
                 <w:szCs w:val="20"/>
+                <w:highlight w:val="cyan"/>
               </w:rPr>
               <w:t>TBD</w:t>
             </w:r>
@@ -1419,8 +1551,9 @@
                 <w:color w:val="333333"/>
                 <w:sz w:val="20"/>
                 <w:szCs w:val="20"/>
-              </w:rPr>
-              <w:t xml:space="preserve">Currently there are no KAs that support a </w:t>
+                <w:highlight w:val="cyan"/>
+              </w:rPr>
+              <w:t>Currently there are no KAs that support a user or Tier I solution.</w:t>
             </w:r>
             <w:r>
               <w:rPr>
@@ -1430,17 +1563,7 @@
                 <w:sz w:val="20"/>
                 <w:szCs w:val="20"/>
               </w:rPr>
-              <w:t>u</w:t>
-            </w:r>
-            <w:r>
-              <w:rPr>
-                <w:rStyle w:val="normaltextrun"/>
-                <w:rFonts w:ascii="Arial" w:eastAsia="Arial" w:hAnsi="Arial" w:cs="Arial"/>
-                <w:color w:val="333333"/>
-                <w:sz w:val="20"/>
-                <w:szCs w:val="20"/>
-              </w:rPr>
-              <w:t xml:space="preserve">ser or Tier I solution. </w:t>
+              <w:t xml:space="preserve"> </w:t>
             </w:r>
           </w:p>
         </w:tc>
@@ -1534,6 +1657,7 @@
                 <w:color w:val="FFFFFF" w:themeColor="background1"/>
                 <w:sz w:val="24"/>
                 <w:szCs w:val="24"/>
+                <w:highlight w:val="green"/>
               </w:rPr>
               <w:lastRenderedPageBreak/>
               <w:t>Solution</w:t>
@@ -1544,6 +1668,7 @@
                 <w:color w:val="FFFFFF" w:themeColor="background1"/>
                 <w:sz w:val="24"/>
                 <w:szCs w:val="24"/>
+                <w:highlight w:val="green"/>
               </w:rPr>
               <w:t xml:space="preserve"> (Portal/</w:t>
             </w:r>
@@ -1553,6 +1678,7 @@
                 <w:color w:val="FFFFFF" w:themeColor="background1"/>
                 <w:sz w:val="24"/>
                 <w:szCs w:val="24"/>
+                <w:highlight w:val="green"/>
               </w:rPr>
               <w:t xml:space="preserve"> User</w:t>
             </w:r>
@@ -1562,6 +1688,7 @@
                 <w:color w:val="FFFFFF" w:themeColor="background1"/>
                 <w:sz w:val="24"/>
                 <w:szCs w:val="24"/>
+                <w:highlight w:val="green"/>
               </w:rPr>
               <w:t xml:space="preserve"> Facing)</w:t>
             </w:r>
@@ -1598,6 +1725,7 @@
                 <w:color w:val="333333"/>
                 <w:sz w:val="20"/>
                 <w:szCs w:val="20"/>
+                <w:highlight w:val="green"/>
               </w:rPr>
             </w:pPr>
             <w:r>
@@ -1609,6 +1737,7 @@
                 <w:color w:val="333333"/>
                 <w:sz w:val="20"/>
                 <w:szCs w:val="20"/>
+                <w:highlight w:val="green"/>
               </w:rPr>
               <w:t>User Solution</w:t>
             </w:r>
@@ -1625,6 +1754,7 @@
                 <w:color w:val="333333"/>
                 <w:sz w:val="20"/>
                 <w:szCs w:val="20"/>
+                <w:highlight w:val="green"/>
               </w:rPr>
             </w:pPr>
           </w:p>
@@ -1649,8 +1779,19 @@
                 <w:color w:val="333333"/>
                 <w:sz w:val="20"/>
                 <w:szCs w:val="20"/>
-              </w:rPr>
-              <w:t xml:space="preserve">Collect the following information to provide to supporting agents: </w:t>
+                <w:highlight w:val="green"/>
+              </w:rPr>
+              <w:t>Collect the following information to provide to supporting agents:</w:t>
+            </w:r>
+            <w:r>
+              <w:rPr>
+                <w:rStyle w:val="normaltextrun"/>
+                <w:rFonts w:ascii="Arial" w:hAnsi="Arial" w:cs="Arial"/>
+                <w:color w:val="333333"/>
+                <w:sz w:val="20"/>
+                <w:szCs w:val="20"/>
+              </w:rPr>
+              <w:t xml:space="preserve"> </w:t>
             </w:r>
           </w:p>
           <w:p>
@@ -1682,6 +1823,7 @@
                 <w:rFonts w:ascii="Arial" w:eastAsia="Arial" w:hAnsi="Arial" w:cs="Arial"/>
                 <w:sz w:val="20"/>
                 <w:szCs w:val="20"/>
+                <w:highlight w:val="green"/>
               </w:rPr>
             </w:pPr>
             <w:r>
@@ -1691,6 +1833,7 @@
                 <w:color w:val="333333"/>
                 <w:sz w:val="20"/>
                 <w:szCs w:val="20"/>
+                <w:highlight w:val="green"/>
               </w:rPr>
               <w:t xml:space="preserve">Location Data. </w:t>
             </w:r>
@@ -1705,11 +1848,13 @@
               <w:spacing w:line="257" w:lineRule="auto"/>
               <w:rPr>
                 <w:rFonts w:ascii="Arial" w:eastAsia="Arial" w:hAnsi="Arial" w:cs="Arial"/>
-              </w:rPr>
-            </w:pPr>
-            <w:r>
-              <w:rPr>
-                <w:rFonts w:ascii="Arial" w:eastAsia="Arial" w:hAnsi="Arial" w:cs="Arial"/>
+                <w:highlight w:val="cyan"/>
+              </w:rPr>
+            </w:pPr>
+            <w:r>
+              <w:rPr>
+                <w:rFonts w:ascii="Arial" w:eastAsia="Arial" w:hAnsi="Arial" w:cs="Arial"/>
+                <w:highlight w:val="cyan"/>
               </w:rPr>
               <w:t>Ship Class / Hull Number (Do not provide any geographical information)</w:t>
             </w:r>
@@ -1724,11 +1869,13 @@
               <w:spacing w:line="257" w:lineRule="auto"/>
               <w:rPr>
                 <w:rFonts w:ascii="Arial" w:eastAsia="Arial" w:hAnsi="Arial" w:cs="Arial"/>
-              </w:rPr>
-            </w:pPr>
-            <w:r>
-              <w:rPr>
-                <w:rFonts w:ascii="Arial" w:eastAsia="Arial" w:hAnsi="Arial" w:cs="Arial"/>
+                <w:highlight w:val="green"/>
+              </w:rPr>
+            </w:pPr>
+            <w:r>
+              <w:rPr>
+                <w:rFonts w:ascii="Arial" w:eastAsia="Arial" w:hAnsi="Arial" w:cs="Arial"/>
+                <w:highlight w:val="green"/>
               </w:rPr>
               <w:t xml:space="preserve">Contact Information </w:t>
             </w:r>
@@ -1744,11 +1891,13 @@
               <w:ind w:left="720"/>
               <w:rPr>
                 <w:rFonts w:ascii="Arial" w:eastAsia="Arial" w:hAnsi="Arial" w:cs="Arial"/>
-              </w:rPr>
-            </w:pPr>
-            <w:r>
-              <w:rPr>
-                <w:rFonts w:ascii="Arial" w:eastAsia="Arial" w:hAnsi="Arial" w:cs="Arial"/>
+                <w:highlight w:val="cyan"/>
+              </w:rPr>
+            </w:pPr>
+            <w:r>
+              <w:rPr>
+                <w:rFonts w:ascii="Arial" w:eastAsia="Arial" w:hAnsi="Arial" w:cs="Arial"/>
+                <w:highlight w:val="cyan"/>
               </w:rPr>
               <w:t>Email and Phone (if available) for primary and secondary contacts.</w:t>
             </w:r>
@@ -1764,11 +1913,13 @@
               <w:ind w:left="720"/>
               <w:rPr>
                 <w:rFonts w:ascii="Arial" w:eastAsia="Arial" w:hAnsi="Arial" w:cs="Arial"/>
-              </w:rPr>
-            </w:pPr>
-            <w:r>
-              <w:rPr>
-                <w:rFonts w:ascii="Arial" w:eastAsia="Arial" w:hAnsi="Arial" w:cs="Arial"/>
+                <w:highlight w:val="cyan"/>
+              </w:rPr>
+            </w:pPr>
+            <w:r>
+              <w:rPr>
+                <w:rFonts w:ascii="Arial" w:eastAsia="Arial" w:hAnsi="Arial" w:cs="Arial"/>
+                <w:highlight w:val="cyan"/>
               </w:rPr>
               <w:t>Quarterdeck or Radio/ADP phone (if available).</w:t>
             </w:r>
@@ -1783,11 +1934,13 @@
               <w:spacing w:line="257" w:lineRule="auto"/>
               <w:rPr>
                 <w:rFonts w:ascii="Arial" w:eastAsia="Arial" w:hAnsi="Arial" w:cs="Arial"/>
-              </w:rPr>
-            </w:pPr>
-            <w:r>
-              <w:rPr>
-                <w:rFonts w:ascii="Arial" w:eastAsia="Arial" w:hAnsi="Arial" w:cs="Arial"/>
+                <w:highlight w:val="green"/>
+              </w:rPr>
+            </w:pPr>
+            <w:r>
+              <w:rPr>
+                <w:rFonts w:ascii="Arial" w:eastAsia="Arial" w:hAnsi="Arial" w:cs="Arial"/>
+                <w:highlight w:val="green"/>
               </w:rPr>
               <w:t xml:space="preserve">System error details. </w:t>
             </w:r>
@@ -1802,19 +1955,15 @@
               <w:spacing w:line="257" w:lineRule="auto"/>
               <w:rPr>
                 <w:rFonts w:ascii="Arial" w:eastAsia="Arial" w:hAnsi="Arial" w:cs="Arial"/>
-              </w:rPr>
-            </w:pPr>
-            <w:r>
-              <w:rPr>
-                <w:rFonts w:ascii="Arial" w:eastAsia="Arial" w:hAnsi="Arial" w:cs="Arial"/>
-              </w:rPr>
-              <w:t xml:space="preserve">Provide affected </w:t>
-            </w:r>
-            <w:r>
-              <w:rPr>
-                <w:rFonts w:ascii="Arial" w:eastAsia="Arial" w:hAnsi="Arial" w:cs="Arial"/>
-              </w:rPr>
-              <w:t>product name category.</w:t>
+                <w:highlight w:val="cyan"/>
+              </w:rPr>
+            </w:pPr>
+            <w:r>
+              <w:rPr>
+                <w:rFonts w:ascii="Arial" w:eastAsia="Arial" w:hAnsi="Arial" w:cs="Arial"/>
+                <w:highlight w:val="cyan"/>
+              </w:rPr>
+              <w:t>Provide affected product name category.</w:t>
             </w:r>
           </w:p>
           <w:p>
@@ -1827,83 +1976,76 @@
               <w:spacing w:line="257" w:lineRule="auto"/>
               <w:rPr>
                 <w:rFonts w:ascii="Arial" w:eastAsia="Arial" w:hAnsi="Arial" w:cs="Arial"/>
-              </w:rPr>
-            </w:pPr>
-            <w:r>
-              <w:rPr>
-                <w:rFonts w:ascii="Arial" w:eastAsia="Arial" w:hAnsi="Arial" w:cs="Arial"/>
-              </w:rPr>
-              <w:t>S</w:t>
-            </w:r>
-            <w:r>
-              <w:rPr>
-                <w:rFonts w:ascii="Arial" w:eastAsia="Arial" w:hAnsi="Arial" w:cs="Arial"/>
-              </w:rPr>
-              <w:t>pecific component</w:t>
-            </w:r>
-            <w:r>
-              <w:rPr>
-                <w:rFonts w:ascii="Arial" w:eastAsia="Arial" w:hAnsi="Arial" w:cs="Arial"/>
-              </w:rPr>
-              <w:t>, serial and</w:t>
-            </w:r>
-            <w:r>
-              <w:rPr>
-                <w:rFonts w:ascii="Arial" w:eastAsia="Arial" w:hAnsi="Arial" w:cs="Arial"/>
-              </w:rPr>
-              <w:t xml:space="preserve"> part number</w:t>
-            </w:r>
-            <w:r>
-              <w:rPr>
-                <w:rFonts w:ascii="Arial" w:eastAsia="Arial" w:hAnsi="Arial" w:cs="Arial"/>
+                <w:highlight w:val="cyan"/>
+              </w:rPr>
+            </w:pPr>
+            <w:r>
+              <w:rPr>
+                <w:rFonts w:ascii="Arial" w:eastAsia="Arial" w:hAnsi="Arial" w:cs="Arial"/>
+                <w:highlight w:val="cyan"/>
+              </w:rPr>
+              <w:t>Specific component, serial and part number</w:t>
+            </w:r>
+            <w:r>
+              <w:rPr>
+                <w:rFonts w:ascii="Arial" w:eastAsia="Arial" w:hAnsi="Arial" w:cs="Arial"/>
+                <w:highlight w:val="cyan"/>
               </w:rPr>
               <w:t xml:space="preserve">, and rack </w:t>
             </w:r>
             <w:r>
               <w:rPr>
                 <w:rFonts w:ascii="Arial" w:eastAsia="Arial" w:hAnsi="Arial" w:cs="Arial"/>
+                <w:highlight w:val="cyan"/>
               </w:rPr>
               <w:t xml:space="preserve">(“U”) </w:t>
             </w:r>
             <w:r>
               <w:rPr>
                 <w:rFonts w:ascii="Arial" w:eastAsia="Arial" w:hAnsi="Arial" w:cs="Arial"/>
+                <w:highlight w:val="cyan"/>
               </w:rPr>
               <w:t>location (</w:t>
             </w:r>
             <w:r>
               <w:rPr>
                 <w:rFonts w:ascii="Arial" w:eastAsia="Arial" w:hAnsi="Arial" w:cs="Arial"/>
+                <w:highlight w:val="cyan"/>
               </w:rPr>
               <w:t>“</w:t>
             </w:r>
             <w:r>
               <w:rPr>
                 <w:rFonts w:ascii="Arial" w:eastAsia="Arial" w:hAnsi="Arial" w:cs="Arial"/>
+                <w:highlight w:val="cyan"/>
               </w:rPr>
               <w:t xml:space="preserve">CVN </w:t>
             </w:r>
             <w:r>
               <w:rPr>
                 <w:rFonts w:ascii="Arial" w:eastAsia="Arial" w:hAnsi="Arial" w:cs="Arial"/>
+                <w:highlight w:val="cyan"/>
               </w:rPr>
               <w:t>Leave Behind</w:t>
             </w:r>
             <w:r>
               <w:rPr>
                 <w:rFonts w:ascii="Arial" w:eastAsia="Arial" w:hAnsi="Arial" w:cs="Arial"/>
+                <w:highlight w:val="cyan"/>
               </w:rPr>
               <w:t xml:space="preserve"> Support”</w:t>
             </w:r>
             <w:r>
               <w:rPr>
                 <w:rFonts w:ascii="Arial" w:eastAsia="Arial" w:hAnsi="Arial" w:cs="Arial"/>
+                <w:highlight w:val="cyan"/>
               </w:rPr>
               <w:t xml:space="preserve"> Job Aid</w:t>
             </w:r>
             <w:r>
               <w:rPr>
                 <w:rFonts w:ascii="Arial" w:eastAsia="Arial" w:hAnsi="Arial" w:cs="Arial"/>
+                <w:highlight w:val="cyan"/>
               </w:rPr>
               <w:t>)</w:t>
             </w:r>
@@ -1918,19 +2060,15 @@
               <w:spacing w:line="257" w:lineRule="auto"/>
               <w:rPr>
                 <w:rFonts w:ascii="Arial" w:eastAsia="Arial" w:hAnsi="Arial" w:cs="Arial"/>
-              </w:rPr>
-            </w:pPr>
-            <w:r>
-              <w:rPr>
-                <w:rFonts w:ascii="Arial" w:eastAsia="Arial" w:hAnsi="Arial" w:cs="Arial"/>
-              </w:rPr>
-              <w:t>Incident Details</w:t>
-            </w:r>
-            <w:r>
-              <w:rPr>
-                <w:rFonts w:ascii="Arial" w:eastAsia="Arial" w:hAnsi="Arial" w:cs="Arial"/>
-              </w:rPr>
-              <w:t>.</w:t>
+                <w:highlight w:val="green"/>
+              </w:rPr>
+            </w:pPr>
+            <w:r>
+              <w:rPr>
+                <w:rFonts w:ascii="Arial" w:eastAsia="Arial" w:hAnsi="Arial" w:cs="Arial"/>
+                <w:highlight w:val="green"/>
+              </w:rPr>
+              <w:t>Incident Details.</w:t>
             </w:r>
           </w:p>
           <w:p>
@@ -1943,11 +2081,13 @@
               <w:spacing w:line="257" w:lineRule="auto"/>
               <w:rPr>
                 <w:rFonts w:ascii="Arial" w:eastAsia="Arial" w:hAnsi="Arial" w:cs="Arial"/>
-              </w:rPr>
-            </w:pPr>
-            <w:r>
-              <w:rPr>
-                <w:rFonts w:ascii="Arial" w:eastAsia="Arial" w:hAnsi="Arial" w:cs="Arial"/>
+                <w:highlight w:val="cyan"/>
+              </w:rPr>
+            </w:pPr>
+            <w:r>
+              <w:rPr>
+                <w:rFonts w:ascii="Arial" w:eastAsia="Arial" w:hAnsi="Arial" w:cs="Arial"/>
+                <w:highlight w:val="cyan"/>
               </w:rPr>
               <w:t xml:space="preserve">Detailed description of the error along with any actions taken prior to the error. </w:t>
             </w:r>
@@ -1962,11 +2102,13 @@
               <w:spacing w:line="257" w:lineRule="auto"/>
               <w:rPr>
                 <w:rFonts w:ascii="Arial" w:eastAsia="Arial" w:hAnsi="Arial" w:cs="Arial"/>
-              </w:rPr>
-            </w:pPr>
-            <w:r>
-              <w:rPr>
-                <w:rFonts w:ascii="Arial" w:eastAsia="Arial" w:hAnsi="Arial" w:cs="Arial"/>
+                <w:highlight w:val="cyan"/>
+              </w:rPr>
+            </w:pPr>
+            <w:r>
+              <w:rPr>
+                <w:rFonts w:ascii="Arial" w:eastAsia="Arial" w:hAnsi="Arial" w:cs="Arial"/>
+                <w:highlight w:val="cyan"/>
               </w:rPr>
               <w:t>What symptoms were observed (system message, email alert, system inoperable, etc.)?</w:t>
             </w:r>
@@ -1981,11 +2123,13 @@
               <w:spacing w:line="257" w:lineRule="auto"/>
               <w:rPr>
                 <w:rFonts w:ascii="Arial" w:eastAsia="Arial" w:hAnsi="Arial" w:cs="Arial"/>
-              </w:rPr>
-            </w:pPr>
-            <w:r>
-              <w:rPr>
-                <w:rFonts w:ascii="Arial" w:eastAsia="Arial" w:hAnsi="Arial" w:cs="Arial"/>
+                <w:highlight w:val="cyan"/>
+              </w:rPr>
+            </w:pPr>
+            <w:r>
+              <w:rPr>
+                <w:rFonts w:ascii="Arial" w:eastAsia="Arial" w:hAnsi="Arial" w:cs="Arial"/>
+                <w:highlight w:val="cyan"/>
               </w:rPr>
               <w:t>Any documentation/KAs attempted following the error.</w:t>
             </w:r>
@@ -2000,11 +2144,13 @@
               <w:spacing w:line="257" w:lineRule="auto"/>
               <w:rPr>
                 <w:rFonts w:ascii="Arial" w:eastAsia="Arial" w:hAnsi="Arial" w:cs="Arial"/>
-              </w:rPr>
-            </w:pPr>
-            <w:r>
-              <w:rPr>
-                <w:rFonts w:ascii="Arial" w:eastAsia="Arial" w:hAnsi="Arial" w:cs="Arial"/>
+                <w:highlight w:val="green"/>
+              </w:rPr>
+            </w:pPr>
+            <w:r>
+              <w:rPr>
+                <w:rFonts w:ascii="Arial" w:eastAsia="Arial" w:hAnsi="Arial" w:cs="Arial"/>
+                <w:highlight w:val="green"/>
               </w:rPr>
               <w:t>Any Error Messages or prompts encountered.</w:t>
             </w:r>
@@ -2019,11 +2165,13 @@
               <w:spacing w:line="257" w:lineRule="auto"/>
               <w:rPr>
                 <w:rFonts w:ascii="Arial" w:eastAsia="Arial" w:hAnsi="Arial" w:cs="Arial"/>
-              </w:rPr>
-            </w:pPr>
-            <w:r>
-              <w:rPr>
-                <w:rFonts w:ascii="Arial" w:eastAsia="Arial" w:hAnsi="Arial" w:cs="Arial"/>
+                <w:highlight w:val="cyan"/>
+              </w:rPr>
+            </w:pPr>
+            <w:r>
+              <w:rPr>
+                <w:rFonts w:ascii="Arial" w:eastAsia="Arial" w:hAnsi="Arial" w:cs="Arial"/>
+                <w:highlight w:val="cyan"/>
               </w:rPr>
               <w:t>All error messages or error codes encountered.</w:t>
             </w:r>
@@ -2038,11 +2186,13 @@
               <w:spacing w:line="257" w:lineRule="auto"/>
               <w:rPr>
                 <w:rFonts w:ascii="Arial" w:eastAsia="Arial" w:hAnsi="Arial" w:cs="Arial"/>
-              </w:rPr>
-            </w:pPr>
-            <w:r>
-              <w:rPr>
-                <w:rFonts w:ascii="Arial" w:eastAsia="Arial" w:hAnsi="Arial" w:cs="Arial"/>
+                <w:highlight w:val="cyan"/>
+              </w:rPr>
+            </w:pPr>
+            <w:r>
+              <w:rPr>
+                <w:rFonts w:ascii="Arial" w:eastAsia="Arial" w:hAnsi="Arial" w:cs="Arial"/>
+                <w:highlight w:val="cyan"/>
               </w:rPr>
               <w:t>Please provide any relevant logs, screenshots, or documentation.</w:t>
             </w:r>
@@ -2057,11 +2207,13 @@
               <w:spacing w:line="257" w:lineRule="auto"/>
               <w:rPr>
                 <w:rFonts w:ascii="Arial" w:eastAsia="Arial" w:hAnsi="Arial" w:cs="Arial"/>
-              </w:rPr>
-            </w:pPr>
-            <w:r>
-              <w:rPr>
-                <w:rFonts w:ascii="Arial" w:eastAsia="Arial" w:hAnsi="Arial" w:cs="Arial"/>
+                <w:highlight w:val="green"/>
+              </w:rPr>
+            </w:pPr>
+            <w:r>
+              <w:rPr>
+                <w:rFonts w:ascii="Arial" w:eastAsia="Arial" w:hAnsi="Arial" w:cs="Arial"/>
+                <w:highlight w:val="green"/>
               </w:rPr>
               <w:t>Any underlying or associated issues that may have contributed to the incident.</w:t>
             </w:r>
@@ -2076,11 +2228,13 @@
               <w:spacing w:line="257" w:lineRule="auto"/>
               <w:rPr>
                 <w:rFonts w:ascii="Arial" w:eastAsia="Arial" w:hAnsi="Arial" w:cs="Arial"/>
-              </w:rPr>
-            </w:pPr>
-            <w:r>
-              <w:rPr>
-                <w:rFonts w:ascii="Arial" w:eastAsia="Arial" w:hAnsi="Arial" w:cs="Arial"/>
+                <w:highlight w:val="cyan"/>
+              </w:rPr>
+            </w:pPr>
+            <w:r>
+              <w:rPr>
+                <w:rFonts w:ascii="Arial" w:eastAsia="Arial" w:hAnsi="Arial" w:cs="Arial"/>
+                <w:highlight w:val="cyan"/>
               </w:rPr>
               <w:t>Environmental conditions (impactful climate, sea state, etc.)</w:t>
             </w:r>
@@ -2095,11 +2249,13 @@
               <w:spacing w:line="257" w:lineRule="auto"/>
               <w:rPr>
                 <w:rFonts w:ascii="Arial" w:eastAsia="Arial" w:hAnsi="Arial" w:cs="Arial"/>
-              </w:rPr>
-            </w:pPr>
-            <w:r>
-              <w:rPr>
-                <w:rFonts w:ascii="Arial" w:eastAsia="Arial" w:hAnsi="Arial" w:cs="Arial"/>
+                <w:highlight w:val="cyan"/>
+              </w:rPr>
+            </w:pPr>
+            <w:r>
+              <w:rPr>
+                <w:rFonts w:ascii="Arial" w:eastAsia="Arial" w:hAnsi="Arial" w:cs="Arial"/>
+                <w:highlight w:val="cyan"/>
               </w:rPr>
               <w:t>Physical conditions (power outages, hardware failures, etc.)</w:t>
             </w:r>
@@ -2114,11 +2270,13 @@
               <w:spacing w:line="257" w:lineRule="auto"/>
               <w:rPr>
                 <w:rFonts w:ascii="Arial" w:eastAsia="Arial" w:hAnsi="Arial" w:cs="Arial"/>
-              </w:rPr>
-            </w:pPr>
-            <w:r>
-              <w:rPr>
-                <w:rFonts w:ascii="Arial" w:eastAsia="Arial" w:hAnsi="Arial" w:cs="Arial"/>
+                <w:highlight w:val="cyan"/>
+              </w:rPr>
+            </w:pPr>
+            <w:r>
+              <w:rPr>
+                <w:rFonts w:ascii="Arial" w:eastAsia="Arial" w:hAnsi="Arial" w:cs="Arial"/>
+                <w:highlight w:val="cyan"/>
               </w:rPr>
               <w:t>Operational conditions (software bugs, configuration issues, patches, etc.)</w:t>
             </w:r>
@@ -2133,11 +2291,13 @@
               <w:spacing w:line="257" w:lineRule="auto"/>
               <w:rPr>
                 <w:rFonts w:ascii="Arial" w:eastAsia="Arial" w:hAnsi="Arial" w:cs="Arial"/>
-              </w:rPr>
-            </w:pPr>
-            <w:r>
-              <w:rPr>
-                <w:rFonts w:ascii="Arial" w:eastAsia="Arial" w:hAnsi="Arial" w:cs="Arial"/>
+                <w:highlight w:val="green"/>
+              </w:rPr>
+            </w:pPr>
+            <w:r>
+              <w:rPr>
+                <w:rFonts w:ascii="Arial" w:eastAsia="Arial" w:hAnsi="Arial" w:cs="Arial"/>
+                <w:highlight w:val="green"/>
               </w:rPr>
               <w:t>Any immediate actions taken to address the error.</w:t>
             </w:r>
@@ -2152,11 +2312,13 @@
               <w:spacing w:line="257" w:lineRule="auto"/>
               <w:rPr>
                 <w:rFonts w:ascii="Arial" w:eastAsia="Arial" w:hAnsi="Arial" w:cs="Arial"/>
-              </w:rPr>
-            </w:pPr>
-            <w:r>
-              <w:rPr>
-                <w:rFonts w:ascii="Arial" w:eastAsia="Arial" w:hAnsi="Arial" w:cs="Arial"/>
+                <w:highlight w:val="cyan"/>
+              </w:rPr>
+            </w:pPr>
+            <w:r>
+              <w:rPr>
+                <w:rFonts w:ascii="Arial" w:eastAsia="Arial" w:hAnsi="Arial" w:cs="Arial"/>
+                <w:highlight w:val="cyan"/>
               </w:rPr>
               <w:t>Associated documentation</w:t>
             </w:r>
@@ -2171,11 +2333,13 @@
               <w:spacing w:line="257" w:lineRule="auto"/>
               <w:rPr>
                 <w:rFonts w:ascii="Arial" w:eastAsia="Arial" w:hAnsi="Arial" w:cs="Arial"/>
-              </w:rPr>
-            </w:pPr>
-            <w:r>
-              <w:rPr>
-                <w:rFonts w:ascii="Arial" w:eastAsia="Arial" w:hAnsi="Arial" w:cs="Arial"/>
+                <w:highlight w:val="green"/>
+              </w:rPr>
+            </w:pPr>
+            <w:r>
+              <w:rPr>
+                <w:rFonts w:ascii="Arial" w:eastAsia="Arial" w:hAnsi="Arial" w:cs="Arial"/>
+                <w:highlight w:val="green"/>
               </w:rPr>
               <w:t>Impact Assessment</w:t>
             </w:r>
@@ -2191,23 +2355,27 @@
               <w:ind w:left="701"/>
               <w:rPr>
                 <w:rFonts w:ascii="Arial" w:eastAsia="Arial" w:hAnsi="Arial" w:cs="Arial"/>
-              </w:rPr>
-            </w:pPr>
-            <w:r>
-              <w:rPr>
-                <w:rFonts w:ascii="Arial" w:eastAsia="Arial" w:hAnsi="Arial" w:cs="Arial"/>
+                <w:highlight w:val="cyan"/>
+              </w:rPr>
+            </w:pPr>
+            <w:r>
+              <w:rPr>
+                <w:rFonts w:ascii="Arial" w:eastAsia="Arial" w:hAnsi="Arial" w:cs="Arial"/>
+                <w:highlight w:val="cyan"/>
               </w:rPr>
               <w:t xml:space="preserve">Any impact </w:t>
             </w:r>
             <w:r>
               <w:rPr>
                 <w:rFonts w:ascii="Arial" w:eastAsia="Arial" w:hAnsi="Arial" w:cs="Arial"/>
+                <w:highlight w:val="cyan"/>
               </w:rPr>
               <w:t xml:space="preserve">on </w:t>
             </w:r>
             <w:r>
               <w:rPr>
                 <w:rFonts w:ascii="Arial" w:eastAsia="Arial" w:hAnsi="Arial" w:cs="Arial"/>
+                <w:highlight w:val="cyan"/>
               </w:rPr>
               <w:t>command operations or users? (system unavailability, performance degradation, CASREP, etc.)</w:t>
             </w:r>
@@ -2227,6 +2395,7 @@
                 <w:rFonts w:ascii="Arial" w:eastAsia="Arial" w:hAnsi="Arial" w:cs="Arial"/>
                 <w:sz w:val="20"/>
                 <w:szCs w:val="20"/>
+                <w:highlight w:val="green"/>
               </w:rPr>
             </w:pPr>
             <w:r>
@@ -2236,6 +2405,7 @@
                 <w:color w:val="333333"/>
                 <w:sz w:val="20"/>
                 <w:szCs w:val="20"/>
+                <w:highlight w:val="green"/>
               </w:rPr>
               <w:t>Attach this knowledge article to the incident.</w:t>
             </w:r>
@@ -2246,9 +2416,24 @@
                 <w:color w:val="333333"/>
                 <w:sz w:val="20"/>
                 <w:szCs w:val="20"/>
+                <w:highlight w:val="green"/>
               </w:rPr>
               <w:t> </w:t>
             </w:r>
+          </w:p>
+          <w:p>
+            <w:pPr>
+              <w:pStyle w:val="paragraph"/>
+              <w:shd w:val="clear" w:color="auto" w:fill="FFFFFF" w:themeFill="background1"/>
+              <w:spacing w:before="0" w:beforeAutospacing="0" w:after="0" w:afterAutospacing="0"/>
+              <w:textAlignment w:val="baseline"/>
+              <w:rPr>
+                <w:rStyle w:val="eop"/>
+                <w:rFonts w:ascii="Arial" w:eastAsia="Arial" w:hAnsi="Arial" w:cs="Arial"/>
+                <w:sz w:val="20"/>
+                <w:szCs w:val="20"/>
+              </w:rPr>
+            </w:pPr>
           </w:p>
           <w:p>
             <w:pPr>
@@ -2272,11 +2457,6 @@
                 <w:sz w:val="20"/>
                 <w:szCs w:val="20"/>
               </w:rPr>
-              <w:pPrChange w:id="0" w:author="Cadell, George W CTR (USA)" w:date="2024-10-24T07:53:00Z">
-                <w:pPr>
-                  <w:pStyle w:val="FieldText"/>
-                </w:pPr>
-              </w:pPrChange>
             </w:pPr>
           </w:p>
         </w:tc>
@@ -2343,6 +2523,7 @@
                 <w:color w:val="FFFFFF" w:themeColor="background1"/>
                 <w:sz w:val="24"/>
                 <w:szCs w:val="24"/>
+                <w:highlight w:val="green"/>
               </w:rPr>
               <w:t>Routing Categories</w:t>
             </w:r>
@@ -2374,6 +2555,7 @@
                 <w:b/>
                 <w:sz w:val="24"/>
                 <w:szCs w:val="24"/>
+                <w:highlight w:val="green"/>
               </w:rPr>
             </w:pPr>
             <w:r>
@@ -2382,6 +2564,7 @@
                 <w:b/>
                 <w:sz w:val="24"/>
                 <w:szCs w:val="24"/>
+                <w:highlight w:val="green"/>
               </w:rPr>
               <w:t>Category Type</w:t>
             </w:r>
@@ -2406,6 +2589,7 @@
                 <w:b/>
                 <w:sz w:val="24"/>
                 <w:szCs w:val="24"/>
+                <w:highlight w:val="cyan"/>
               </w:rPr>
             </w:pPr>
             <w:r>
@@ -2414,6 +2598,7 @@
                 <w:b/>
                 <w:sz w:val="24"/>
                 <w:szCs w:val="24"/>
+                <w:highlight w:val="cyan"/>
               </w:rPr>
               <w:t>Category Field</w:t>
             </w:r>
@@ -2444,6 +2629,7 @@
                 <w:rFonts w:ascii="Arial" w:hAnsi="Arial" w:cs="Arial"/>
                 <w:sz w:val="24"/>
                 <w:szCs w:val="24"/>
+                <w:highlight w:val="green"/>
               </w:rPr>
             </w:pPr>
             <w:r>
@@ -2451,6 +2637,7 @@
                 <w:rFonts w:ascii="Arial" w:hAnsi="Arial" w:cs="Arial"/>
                 <w:sz w:val="24"/>
                 <w:szCs w:val="24"/>
+                <w:highlight w:val="green"/>
               </w:rPr>
               <w:t xml:space="preserve">Operational Category </w:t>
             </w:r>
@@ -2459,6 +2646,7 @@
                 <w:rFonts w:ascii="Arial" w:hAnsi="Arial" w:cs="Arial"/>
                 <w:sz w:val="24"/>
                 <w:szCs w:val="24"/>
+                <w:highlight w:val="green"/>
               </w:rPr>
               <w:t>T1</w:t>
             </w:r>
@@ -2484,6 +2672,7 @@
                 <w:b/>
                 <w:sz w:val="24"/>
                 <w:szCs w:val="24"/>
+                <w:highlight w:val="cyan"/>
               </w:rPr>
             </w:pPr>
             <w:r>
@@ -2492,6 +2681,7 @@
                 <w:b/>
                 <w:sz w:val="24"/>
                 <w:szCs w:val="24"/>
+                <w:highlight w:val="cyan"/>
               </w:rPr>
               <w:t>Fault / Failure</w:t>
             </w:r>
@@ -2522,6 +2712,7 @@
                 <w:rFonts w:ascii="Arial" w:hAnsi="Arial" w:cs="Arial"/>
                 <w:sz w:val="24"/>
                 <w:szCs w:val="24"/>
+                <w:highlight w:val="green"/>
               </w:rPr>
             </w:pPr>
             <w:r>
@@ -2529,6 +2720,7 @@
                 <w:rFonts w:ascii="Arial" w:hAnsi="Arial" w:cs="Arial"/>
                 <w:sz w:val="24"/>
                 <w:szCs w:val="24"/>
+                <w:highlight w:val="green"/>
               </w:rPr>
               <w:t>Operational Category T2</w:t>
             </w:r>
@@ -2554,6 +2746,7 @@
                 <w:b/>
                 <w:sz w:val="24"/>
                 <w:szCs w:val="24"/>
+                <w:highlight w:val="cyan"/>
               </w:rPr>
             </w:pPr>
             <w:r>
@@ -2562,6 +2755,7 @@
                 <w:b/>
                 <w:sz w:val="24"/>
                 <w:szCs w:val="24"/>
+                <w:highlight w:val="cyan"/>
               </w:rPr>
               <w:t>Hardware</w:t>
             </w:r>
@@ -2592,6 +2786,7 @@
                 <w:rFonts w:ascii="Arial" w:hAnsi="Arial" w:cs="Arial"/>
                 <w:sz w:val="24"/>
                 <w:szCs w:val="24"/>
+                <w:highlight w:val="green"/>
               </w:rPr>
             </w:pPr>
             <w:r>
@@ -2599,6 +2794,7 @@
                 <w:rFonts w:ascii="Arial" w:hAnsi="Arial" w:cs="Arial"/>
                 <w:sz w:val="24"/>
                 <w:szCs w:val="24"/>
+                <w:highlight w:val="green"/>
               </w:rPr>
               <w:t>Operational Category T3</w:t>
             </w:r>
@@ -2623,6 +2819,7 @@
                 <w:b/>
                 <w:sz w:val="24"/>
                 <w:szCs w:val="24"/>
+                <w:highlight w:val="cyan"/>
               </w:rPr>
             </w:pPr>
             <w:r>
@@ -2631,6 +2828,7 @@
                 <w:b/>
                 <w:sz w:val="24"/>
                 <w:szCs w:val="24"/>
+                <w:highlight w:val="cyan"/>
               </w:rPr>
               <w:t>N/A</w:t>
             </w:r>
@@ -2661,6 +2859,7 @@
                 <w:rFonts w:ascii="Arial" w:hAnsi="Arial" w:cs="Arial"/>
                 <w:sz w:val="24"/>
                 <w:szCs w:val="24"/>
+                <w:highlight w:val="green"/>
               </w:rPr>
             </w:pPr>
             <w:r>
@@ -2668,6 +2867,7 @@
                 <w:rFonts w:ascii="Arial" w:hAnsi="Arial" w:cs="Arial"/>
                 <w:sz w:val="24"/>
                 <w:szCs w:val="24"/>
+                <w:highlight w:val="green"/>
               </w:rPr>
               <w:t>Product Category T1</w:t>
             </w:r>
@@ -2692,6 +2892,7 @@
                 <w:b/>
                 <w:sz w:val="24"/>
                 <w:szCs w:val="24"/>
+                <w:highlight w:val="cyan"/>
               </w:rPr>
             </w:pPr>
             <w:r>
@@ -2700,6 +2901,7 @@
                 <w:b/>
                 <w:sz w:val="24"/>
                 <w:szCs w:val="24"/>
+                <w:highlight w:val="cyan"/>
               </w:rPr>
               <w:t>FSE</w:t>
             </w:r>
@@ -2730,6 +2932,7 @@
                 <w:rFonts w:ascii="Arial" w:hAnsi="Arial" w:cs="Arial"/>
                 <w:sz w:val="24"/>
                 <w:szCs w:val="24"/>
+                <w:highlight w:val="green"/>
               </w:rPr>
             </w:pPr>
             <w:r>
@@ -2737,6 +2940,7 @@
                 <w:rFonts w:ascii="Arial" w:hAnsi="Arial" w:cs="Arial"/>
                 <w:sz w:val="24"/>
                 <w:szCs w:val="24"/>
+                <w:highlight w:val="green"/>
               </w:rPr>
               <w:t>Product Category T2</w:t>
             </w:r>
@@ -2761,6 +2965,7 @@
                 <w:b/>
                 <w:sz w:val="24"/>
                 <w:szCs w:val="24"/>
+                <w:highlight w:val="cyan"/>
               </w:rPr>
             </w:pPr>
             <w:r>
@@ -2769,6 +2974,7 @@
                 <w:b/>
                 <w:sz w:val="24"/>
                 <w:szCs w:val="24"/>
+                <w:highlight w:val="cyan"/>
               </w:rPr>
               <w:t>FSW</w:t>
             </w:r>
@@ -2799,6 +3005,7 @@
                 <w:rFonts w:ascii="Arial" w:hAnsi="Arial" w:cs="Arial"/>
                 <w:sz w:val="24"/>
                 <w:szCs w:val="24"/>
+                <w:highlight w:val="green"/>
               </w:rPr>
             </w:pPr>
             <w:r>
@@ -2806,7 +3013,9 @@
                 <w:rFonts w:ascii="Arial" w:hAnsi="Arial" w:cs="Arial"/>
                 <w:sz w:val="24"/>
                 <w:szCs w:val="24"/>
-              </w:rPr>
+                <w:highlight w:val="green"/>
+              </w:rPr>
+              <w:lastRenderedPageBreak/>
               <w:t>Product Category T3</w:t>
             </w:r>
           </w:p>
@@ -2830,6 +3039,7 @@
                 <w:b/>
                 <w:sz w:val="24"/>
                 <w:szCs w:val="24"/>
+                <w:highlight w:val="cyan"/>
               </w:rPr>
             </w:pPr>
             <w:r>
@@ -2838,6 +3048,7 @@
                 <w:b/>
                 <w:sz w:val="24"/>
                 <w:szCs w:val="24"/>
+                <w:highlight w:val="cyan"/>
               </w:rPr>
               <w:t>Hardware</w:t>
             </w:r>
@@ -2870,6 +3081,7 @@
                 <w:bCs/>
                 <w:sz w:val="24"/>
                 <w:szCs w:val="24"/>
+                <w:highlight w:val="green"/>
               </w:rPr>
             </w:pPr>
             <w:r>
@@ -2879,8 +3091,8 @@
                 <w:bCs/>
                 <w:sz w:val="24"/>
                 <w:szCs w:val="24"/>
-              </w:rPr>
-              <w:lastRenderedPageBreak/>
+                <w:highlight w:val="green"/>
+              </w:rPr>
               <w:t>R</w:t>
             </w:r>
             <w:r>
@@ -2890,6 +3102,7 @@
                 <w:bCs/>
                 <w:sz w:val="24"/>
                 <w:szCs w:val="24"/>
+                <w:highlight w:val="green"/>
               </w:rPr>
               <w:t>eason for Escalation</w:t>
             </w:r>
@@ -2916,6 +3129,7 @@
                 <w:color w:val="000000"/>
                 <w:sz w:val="22"/>
                 <w:szCs w:val="22"/>
+                <w:highlight w:val="cyan"/>
               </w:rPr>
             </w:pPr>
             <w:r>
@@ -2926,6 +3140,7 @@
                 <w:color w:val="000000" w:themeColor="text1"/>
                 <w:sz w:val="22"/>
                 <w:szCs w:val="22"/>
+                <w:highlight w:val="cyan"/>
               </w:rPr>
               <w:t>N/A</w:t>
             </w:r>
@@ -2939,6 +3154,7 @@
                 <w:bCs/>
                 <w:sz w:val="24"/>
                 <w:szCs w:val="24"/>
+                <w:highlight w:val="cyan"/>
               </w:rPr>
             </w:pPr>
           </w:p>
@@ -3037,6 +3253,7 @@
                 <w:color w:val="FFFFFF" w:themeColor="background1"/>
                 <w:sz w:val="24"/>
                 <w:szCs w:val="24"/>
+                <w:highlight w:val="green"/>
               </w:rPr>
             </w:pPr>
             <w:r>
@@ -3045,6 +3262,7 @@
                 <w:color w:val="FFFFFF" w:themeColor="background1"/>
                 <w:sz w:val="24"/>
                 <w:szCs w:val="24"/>
+                <w:highlight w:val="green"/>
               </w:rPr>
               <w:t>Metatags, Keywords, Aliases</w:t>
             </w:r>
@@ -3075,6 +3293,7 @@
                 <w:b w:val="0"/>
                 <w:sz w:val="24"/>
                 <w:szCs w:val="24"/>
+                <w:highlight w:val="green"/>
               </w:rPr>
             </w:pPr>
             <w:r>
@@ -3083,26 +3302,9 @@
                 <w:b w:val="0"/>
                 <w:sz w:val="22"/>
                 <w:szCs w:val="24"/>
-              </w:rPr>
-              <w:t>Provide keywords, phrases, or alternative names for the application or issue. Use</w:t>
-            </w:r>
-            <w:r>
-              <w:rPr>
-                <w:rFonts w:cs="Arial"/>
-                <w:b w:val="0"/>
-                <w:sz w:val="22"/>
-                <w:szCs w:val="24"/>
-              </w:rPr>
-              <w:t>d</w:t>
-            </w:r>
-            <w:r>
-              <w:rPr>
-                <w:rFonts w:cs="Arial"/>
-                <w:b w:val="0"/>
-                <w:sz w:val="22"/>
-                <w:szCs w:val="24"/>
-              </w:rPr>
-              <w:t xml:space="preserve"> to increase searchability of the knowledge article.</w:t>
+                <w:highlight w:val="green"/>
+              </w:rPr>
+              <w:t>Provide keywords, phrases, or alternative names for the application or issue. Used to increase searchability of the knowledge article.</w:t>
             </w:r>
           </w:p>
         </w:tc>
@@ -3294,6 +3496,7 @@
                 <w:color w:val="FFFFFF" w:themeColor="background1"/>
                 <w:sz w:val="24"/>
                 <w:szCs w:val="24"/>
+                <w:highlight w:val="green"/>
               </w:rPr>
               <w:t>Type of Content Change – For Knowledge Management Internal Use</w:t>
             </w:r>
@@ -3331,6 +3534,7 @@
                 <w:rFonts w:ascii="Arial" w:hAnsi="Arial" w:cs="Arial"/>
                 <w:sz w:val="24"/>
                 <w:szCs w:val="24"/>
+                <w:highlight w:val="green"/>
               </w:rPr>
               <w:t>Date:</w:t>
             </w:r>
@@ -3386,16 +3590,9 @@
                 <w:rFonts w:ascii="Arial" w:hAnsi="Arial" w:cs="Arial"/>
                 <w:sz w:val="24"/>
                 <w:szCs w:val="24"/>
-              </w:rPr>
-              <w:t>Type</w:t>
-            </w:r>
-            <w:r>
-              <w:rPr>
-                <w:rFonts w:ascii="Arial" w:hAnsi="Arial" w:cs="Arial"/>
-                <w:sz w:val="24"/>
-                <w:szCs w:val="24"/>
-              </w:rPr>
-              <w:t>:</w:t>
+                <w:highlight w:val="green"/>
+              </w:rPr>
+              <w:t>Type:</w:t>
             </w:r>
           </w:p>
         </w:tc>
@@ -3491,6 +3688,7 @@
                 <w:rFonts w:ascii="Arial" w:hAnsi="Arial" w:cs="Arial"/>
                 <w:sz w:val="24"/>
                 <w:szCs w:val="24"/>
+                <w:highlight w:val="green"/>
               </w:rPr>
               <w:t>Program:</w:t>
             </w:r>
@@ -3631,6 +3829,7 @@
                 <w:color w:val="FFFFFF" w:themeColor="background1"/>
                 <w:sz w:val="24"/>
                 <w:szCs w:val="24"/>
+                <w:highlight w:val="green"/>
               </w:rPr>
             </w:pPr>
             <w:r>
@@ -3639,6 +3838,7 @@
                 <w:color w:val="FFFFFF" w:themeColor="background1"/>
                 <w:sz w:val="24"/>
                 <w:szCs w:val="24"/>
+                <w:highlight w:val="green"/>
               </w:rPr>
               <w:t>Job Aid(s) – For Knowledge Management Internal Use</w:t>
             </w:r>
@@ -3670,6 +3870,7 @@
                 <w:rFonts w:ascii="Arial" w:hAnsi="Arial" w:cs="Arial"/>
                 <w:sz w:val="24"/>
                 <w:szCs w:val="24"/>
+                <w:highlight w:val="green"/>
               </w:rPr>
             </w:pPr>
             <w:r>
@@ -3677,6 +3878,7 @@
                 <w:rFonts w:ascii="Arial" w:hAnsi="Arial" w:cs="Arial"/>
                 <w:sz w:val="24"/>
                 <w:szCs w:val="24"/>
+                <w:highlight w:val="green"/>
               </w:rPr>
               <w:t>Job Aid(s) Required:</w:t>
             </w:r>
@@ -3768,16 +3970,9 @@
                 <w:rFonts w:ascii="Arial" w:hAnsi="Arial" w:cs="Arial"/>
                 <w:sz w:val="24"/>
                 <w:szCs w:val="24"/>
-              </w:rPr>
-              <w:t>Publish to Portal</w:t>
-            </w:r>
-            <w:r>
-              <w:rPr>
-                <w:rFonts w:ascii="Arial" w:hAnsi="Arial" w:cs="Arial"/>
-                <w:sz w:val="24"/>
-                <w:szCs w:val="24"/>
-              </w:rPr>
-              <w:t>:</w:t>
+                <w:highlight w:val="green"/>
+              </w:rPr>
+              <w:t>Publish to Portal:</w:t>
             </w:r>
           </w:p>
         </w:tc>
@@ -3861,6 +4056,7 @@
                 <w:rFonts w:ascii="Arial" w:hAnsi="Arial" w:cs="Arial"/>
                 <w:sz w:val="24"/>
                 <w:szCs w:val="24"/>
+                <w:highlight w:val="green"/>
               </w:rPr>
             </w:pPr>
             <w:r>
@@ -3868,6 +4064,7 @@
                 <w:rFonts w:ascii="Arial" w:hAnsi="Arial" w:cs="Arial"/>
                 <w:sz w:val="24"/>
                 <w:szCs w:val="24"/>
+                <w:highlight w:val="green"/>
               </w:rPr>
               <w:t>Job Aid Title(s):</w:t>
             </w:r>
@@ -3894,6 +4091,35 @@
                 <w:szCs w:val="24"/>
               </w:rPr>
             </w:pPr>
+            <w:r>
+              <w:rPr>
+                <w:rFonts w:cs="Arial"/>
+                <w:sz w:val="24"/>
+                <w:szCs w:val="24"/>
+                <w:highlight w:val="cyan"/>
+              </w:rPr>
+              <w:t xml:space="preserve">Insert reference docs used in </w:t>
+            </w:r>
+            <w:proofErr w:type="gramStart"/>
+            <w:r>
+              <w:rPr>
+                <w:rFonts w:cs="Arial"/>
+                <w:sz w:val="24"/>
+                <w:szCs w:val="24"/>
+                <w:highlight w:val="cyan"/>
+              </w:rPr>
+              <w:t>the RAG</w:t>
+            </w:r>
+            <w:proofErr w:type="gramEnd"/>
+            <w:r>
+              <w:rPr>
+                <w:rFonts w:cs="Arial"/>
+                <w:sz w:val="24"/>
+                <w:szCs w:val="24"/>
+                <w:highlight w:val="cyan"/>
+              </w:rPr>
+              <w:t xml:space="preserve"> and manual addition as well</w:t>
+            </w:r>
           </w:p>
         </w:tc>
       </w:tr>
@@ -3922,6 +4148,7 @@
                 <w:b w:val="0"/>
                 <w:sz w:val="24"/>
                 <w:szCs w:val="24"/>
+                <w:highlight w:val="green"/>
               </w:rPr>
             </w:pPr>
             <w:r>
@@ -3930,6 +4157,7 @@
                 <w:b w:val="0"/>
                 <w:sz w:val="24"/>
                 <w:szCs w:val="24"/>
+                <w:highlight w:val="green"/>
               </w:rPr>
               <w:t>Attach Job Aid(s) in the space provided below:</w:t>
             </w:r>
@@ -3947,6 +4175,7 @@
                 <w:b w:val="0"/>
                 <w:sz w:val="20"/>
                 <w:szCs w:val="20"/>
+                <w:highlight w:val="green"/>
               </w:rPr>
             </w:pPr>
             <w:r>
@@ -3955,26 +4184,9 @@
                 <w:b w:val="0"/>
                 <w:sz w:val="20"/>
                 <w:szCs w:val="20"/>
-              </w:rPr>
-              <w:t>To insert the job aid as an object, from the “Insert” tab, click</w:t>
-            </w:r>
-            <w:r>
-              <w:rPr>
-                <w:rFonts w:cs="Arial"/>
-                <w:b w:val="0"/>
-                <w:sz w:val="20"/>
-                <w:szCs w:val="20"/>
-              </w:rPr>
-              <w:t xml:space="preserve"> “Object”</w:t>
-            </w:r>
-            <w:r>
-              <w:rPr>
-                <w:rFonts w:cs="Arial"/>
-                <w:b w:val="0"/>
-                <w:sz w:val="20"/>
-                <w:szCs w:val="20"/>
-              </w:rPr>
-              <w:t xml:space="preserve"> menu option on the right side of the tab.</w:t>
+                <w:highlight w:val="green"/>
+              </w:rPr>
+              <w:t>To insert the job aid as an object, from the “Insert” tab, click “Object” menu option on the right side of the tab.</w:t>
             </w:r>
           </w:p>
           <w:p>
@@ -3990,6 +4202,7 @@
                 <w:b w:val="0"/>
                 <w:sz w:val="20"/>
                 <w:szCs w:val="20"/>
+                <w:highlight w:val="green"/>
               </w:rPr>
             </w:pPr>
             <w:r>
@@ -3998,44 +4211,9 @@
                 <w:b w:val="0"/>
                 <w:sz w:val="20"/>
                 <w:szCs w:val="20"/>
-              </w:rPr>
-              <w:t>Select “</w:t>
-            </w:r>
-            <w:r>
-              <w:rPr>
-                <w:rFonts w:cs="Arial"/>
-                <w:b w:val="0"/>
-                <w:sz w:val="20"/>
-                <w:szCs w:val="20"/>
-              </w:rPr>
-              <w:t xml:space="preserve">the </w:t>
-            </w:r>
-            <w:r>
-              <w:rPr>
-                <w:rFonts w:cs="Arial"/>
-                <w:b w:val="0"/>
-                <w:sz w:val="20"/>
-                <w:szCs w:val="20"/>
-              </w:rPr>
-              <w:t>Create from File”</w:t>
-            </w:r>
-            <w:r>
-              <w:rPr>
-                <w:rFonts w:cs="Arial"/>
-                <w:b w:val="0"/>
-                <w:sz w:val="20"/>
-                <w:szCs w:val="20"/>
-              </w:rPr>
-              <w:t xml:space="preserve"> tab</w:t>
-            </w:r>
-            <w:r>
-              <w:rPr>
-                <w:rFonts w:cs="Arial"/>
-                <w:b w:val="0"/>
-                <w:sz w:val="20"/>
-                <w:szCs w:val="20"/>
-              </w:rPr>
-              <w:t>. Browse to the job aid and select the file to attach.</w:t>
+                <w:highlight w:val="green"/>
+              </w:rPr>
+              <w:t>Select “the Create from File” tab. Browse to the job aid and select the file to attach.</w:t>
             </w:r>
           </w:p>
           <w:p>
@@ -4059,6 +4237,7 @@
                 <w:b w:val="0"/>
                 <w:sz w:val="20"/>
                 <w:szCs w:val="20"/>
+                <w:highlight w:val="green"/>
               </w:rPr>
               <w:t>Click “Display As Icon” to display the attached job aid as an icon.</w:t>
             </w:r>
@@ -4115,7 +4294,7 @@
     <w:p>
       <w:pPr>
         <w:rPr>
-          <w:ins w:id="1" w:author="Cadell, George W CTR (USA)" w:date="2024-10-23T11:53:00Z"/>
+          <w:ins w:id="0" w:author="Cadell, George W CTR (USA)" w:date="2024-10-23T11:53:00Z"/>
           <w:b/>
           <w:bCs/>
           <w:iCs/>
@@ -4253,9 +4432,9 @@
             </wp:anchor>
           </w:drawing>
         </mc:Choice>
-        <mc:Fallback xmlns:arto="http://schemas.microsoft.com/office/word/2006/arto" xmlns:a="http://schemas.openxmlformats.org/drawingml/2006/main" xmlns:a14="http://schemas.microsoft.com/office/drawing/2010/main">
-          <w:pict w14:anchorId="1C97361A">
-            <v:line id="Line 2" style="position:absolute;flip:y;z-index:251658240;visibility:visible;mso-wrap-style:square;mso-width-percent:0;mso-height-percent:0;mso-wrap-distance-left:9pt;mso-wrap-distance-top:0;mso-wrap-distance-right:9pt;mso-wrap-distance-bottom:0;mso-position-horizontal:absolute;mso-position-horizontal-relative:text;mso-position-vertical:absolute;mso-position-vertical-relative:text;mso-width-percent:0;mso-height-percent:0;mso-width-relative:page;mso-height-relative:page" o:spid="_x0000_s1026" from="-36pt,-1.05pt" to="7in,-1.05pt" w14:anchorId="6BEF4754" o:gfxdata="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"/>
+        <mc:Fallback>
+          <w:pict>
+            <v:line w14:anchorId="6D961C85" id="Line 2" o:spid="_x0000_s1026" style="position:absolute;flip:y;z-index:251657216;visibility:visible;mso-wrap-style:square;mso-width-percent:0;mso-height-percent:0;mso-wrap-distance-left:9pt;mso-wrap-distance-top:0;mso-wrap-distance-right:9pt;mso-wrap-distance-bottom:0;mso-position-horizontal:absolute;mso-position-horizontal-relative:text;mso-position-vertical:absolute;mso-position-vertical-relative:text;mso-width-percent:0;mso-height-percent:0;mso-width-relative:page;mso-height-relative:page" from="-36pt,-1.05pt" to="7in,-1.05pt" o:gfxdata="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"/>
           </w:pict>
         </mc:Fallback>
       </mc:AlternateContent>
@@ -9298,6 +9477,7 @@
     <w:rsid w:val="0009513D"/>
     <w:rsid w:val="000A5952"/>
     <w:rsid w:val="001831A4"/>
+    <w:rsid w:val="001A04FF"/>
     <w:rsid w:val="00264243"/>
     <w:rsid w:val="00266E8B"/>
     <w:rsid w:val="00272A7E"/>
@@ -9339,6 +9519,7 @@
     <w:rsid w:val="00BA74C2"/>
     <w:rsid w:val="00BC63CB"/>
     <w:rsid w:val="00C22E9F"/>
+    <w:rsid w:val="00C9447E"/>
     <w:rsid w:val="00C9760F"/>
     <w:rsid w:val="00CA6937"/>
     <w:rsid w:val="00CD0058"/>
@@ -10351,19 +10532,6 @@
 </file>
 
 <file path=customXml/item2.xml><?xml version="1.0" encoding="utf-8"?>
-<?mso-contentType ?>
-<FormTemplates xmlns="http://schemas.microsoft.com/sharepoint/v3/contenttype/forms">
-  <Display>DocumentLibraryForm</Display>
-  <Edit>DocumentLibraryForm</Edit>
-  <New>DocumentLibraryForm</New>
-</FormTemplates>
-</file>
-
-<file path=customXml/item3.xml><?xml version="1.0" encoding="utf-8"?>
-<b:Sources xmlns:b="http://schemas.openxmlformats.org/officeDocument/2006/bibliography" xmlns="http://schemas.openxmlformats.org/officeDocument/2006/bibliography" SelectedStyle="\APA.XSL" StyleName="APA Fifth Edition"/>
-</file>
-
-<file path=customXml/item4.xml><?xml version="1.0" encoding="utf-8"?>
 <p:properties xmlns:p="http://schemas.microsoft.com/office/2006/metadata/properties" xmlns:xsi="http://www.w3.org/2001/XMLSchema-instance" xmlns:pc="http://schemas.microsoft.com/office/infopath/2007/PartnerControls">
   <documentManagement>
     <SharedWithUsers xmlns="f7d9bffe-eacb-4692-b8d9-0881ab505405">
@@ -10379,6 +10547,19 @@
     <TaxCatchAll xmlns="f7d9bffe-eacb-4692-b8d9-0881ab505405" xsi:nil="true"/>
   </documentManagement>
 </p:properties>
+</file>
+
+<file path=customXml/item3.xml><?xml version="1.0" encoding="utf-8"?>
+<b:Sources xmlns:b="http://schemas.openxmlformats.org/officeDocument/2006/bibliography" xmlns="http://schemas.openxmlformats.org/officeDocument/2006/bibliography" SelectedStyle="\APA.XSL" StyleName="APA Fifth Edition"/>
+</file>
+
+<file path=customXml/item4.xml><?xml version="1.0" encoding="utf-8"?>
+<?mso-contentType ?>
+<FormTemplates xmlns="http://schemas.microsoft.com/sharepoint/v3/contenttype/forms">
+  <Display>DocumentLibraryForm</Display>
+  <Edit>DocumentLibraryForm</Edit>
+  <New>DocumentLibraryForm</New>
+</FormTemplates>
 </file>
 
 <file path=customXml/itemProps1.xml><?xml version="1.0" encoding="utf-8"?>
@@ -10401,9 +10582,12 @@
 </file>
 
 <file path=customXml/itemProps2.xml><?xml version="1.0" encoding="utf-8"?>
-<ds:datastoreItem xmlns:ds="http://schemas.openxmlformats.org/officeDocument/2006/customXml" ds:itemID="{B13C45BE-24DF-4EE0-A0EE-762ABE77714C}">
+<ds:datastoreItem xmlns:ds="http://schemas.openxmlformats.org/officeDocument/2006/customXml" ds:itemID="{488C683C-2B52-4BB4-AE37-B675D3309BD0}">
   <ds:schemaRefs>
-    <ds:schemaRef ds:uri="http://schemas.microsoft.com/sharepoint/v3/contenttype/forms"/>
+    <ds:schemaRef ds:uri="http://schemas.microsoft.com/office/2006/metadata/properties"/>
+    <ds:schemaRef ds:uri="http://schemas.microsoft.com/office/infopath/2007/PartnerControls"/>
+    <ds:schemaRef ds:uri="f7d9bffe-eacb-4692-b8d9-0881ab505405"/>
+    <ds:schemaRef ds:uri="c40d1508-8502-4dd0-8563-6f5cf2a271e1"/>
   </ds:schemaRefs>
 </ds:datastoreItem>
 </file>
@@ -10417,12 +10601,9 @@
 </file>
 
 <file path=customXml/itemProps4.xml><?xml version="1.0" encoding="utf-8"?>
-<ds:datastoreItem xmlns:ds="http://schemas.openxmlformats.org/officeDocument/2006/customXml" ds:itemID="{488C683C-2B52-4BB4-AE37-B675D3309BD0}">
+<ds:datastoreItem xmlns:ds="http://schemas.openxmlformats.org/officeDocument/2006/customXml" ds:itemID="{B13C45BE-24DF-4EE0-A0EE-762ABE77714C}">
   <ds:schemaRefs>
-    <ds:schemaRef ds:uri="http://schemas.microsoft.com/office/2006/metadata/properties"/>
-    <ds:schemaRef ds:uri="http://schemas.microsoft.com/office/infopath/2007/PartnerControls"/>
-    <ds:schemaRef ds:uri="f7d9bffe-eacb-4692-b8d9-0881ab505405"/>
-    <ds:schemaRef ds:uri="c40d1508-8502-4dd0-8563-6f5cf2a271e1"/>
+    <ds:schemaRef ds:uri="http://schemas.microsoft.com/sharepoint/v3/contenttype/forms"/>
   </ds:schemaRefs>
 </ds:datastoreItem>
 </file>

</xml_diff>